<commit_message>
HW report and related files
</commit_message>
<xml_diff>
--- a/2_Assessments/HW_Report.docx
+++ b/2_Assessments/HW_Report.docx
@@ -560,6 +560,7 @@
     <w:p>
       <w:pPr>
         <w:pStyle w:val="TOCHeading"/>
+        <w:spacing w:after="120"/>
         <w:rPr>
           <w:lang w:val="en-US"/>
         </w:rPr>
@@ -573,11 +574,18 @@
       </w:r>
     </w:p>
     <w:p>
-      <w:r>
-        <w:rPr>
-          <w:highlight w:val="yellow"/>
-        </w:rPr>
-        <w:t>Text</w:t>
+      <w:pPr>
+        <w:rPr>
+          <w:sz w:val="24"/>
+          <w:szCs w:val="28"/>
+        </w:rPr>
+      </w:pPr>
+      <w:r>
+        <w:rPr>
+          <w:sz w:val="24"/>
+          <w:szCs w:val="28"/>
+        </w:rPr>
+        <w:t>This project presents the development of an audio-driven lighting control device built on an STM32 microcontroller and a CS4271 audio codec. The system accepts audio from a line-in connector, an on-board microphone, or an optional Bluetooth interface via an ESP32 module. The analog front end provides amplification, volume control, and filtering before the codec digitizes the signal at 48 kHz for processing. The STM32 extracts audio features to generate DMX512 lighting data, transmitted through an isolated RS-485 interface, while the audio stream is simultaneously converted back to analog and made available on line-out and headphone outputs. The hardware was implemented on a custom four-layer PCB and verified through a structured testing procedure covering power rails, audio paths, codec operation, and DMX output.</w:t>
       </w:r>
     </w:p>
     <w:p>
@@ -651,6 +659,7 @@
               <w:noProof/>
               <w:kern w:val="2"/>
               <w:sz w:val="24"/>
+              <w:lang/>
               <w14:ligatures w14:val="standardContextual"/>
             </w:rPr>
           </w:pPr>
@@ -663,7 +672,7 @@
           <w:r>
             <w:fldChar w:fldCharType="separate"/>
           </w:r>
-          <w:hyperlink w:anchor="_Toc214631492" w:history="1">
+          <w:hyperlink w:anchor="_Toc214661769" w:history="1">
             <w:r>
               <w:rPr>
                 <w:rStyle w:val="Hyperlink"/>
@@ -678,6 +687,7 @@
                 <w:noProof/>
                 <w:kern w:val="2"/>
                 <w:sz w:val="24"/>
+                <w:lang/>
                 <w14:ligatures w14:val="standardContextual"/>
               </w:rPr>
               <w:tab/>
@@ -709,7 +719,7 @@
                 <w:noProof/>
                 <w:webHidden/>
               </w:rPr>
-              <w:instrText xml:space="preserve"> PAGEREF _Toc214631492 \h </w:instrText>
+              <w:instrText xml:space="preserve"> PAGEREF _Toc214661769 \h </w:instrText>
             </w:r>
             <w:r>
               <w:rPr>
@@ -748,10 +758,11 @@
               <w:noProof/>
               <w:kern w:val="2"/>
               <w:sz w:val="24"/>
+              <w:lang/>
               <w14:ligatures w14:val="standardContextual"/>
             </w:rPr>
           </w:pPr>
-          <w:hyperlink w:anchor="_Toc214631493" w:history="1">
+          <w:hyperlink w:anchor="_Toc214661770" w:history="1">
             <w:r>
               <w:rPr>
                 <w:rStyle w:val="Hyperlink"/>
@@ -766,6 +777,7 @@
                 <w:noProof/>
                 <w:kern w:val="2"/>
                 <w:sz w:val="24"/>
+                <w:lang/>
                 <w14:ligatures w14:val="standardContextual"/>
               </w:rPr>
               <w:tab/>
@@ -797,7 +809,7 @@
                 <w:noProof/>
                 <w:webHidden/>
               </w:rPr>
-              <w:instrText xml:space="preserve"> PAGEREF _Toc214631493 \h </w:instrText>
+              <w:instrText xml:space="preserve"> PAGEREF _Toc214661770 \h </w:instrText>
             </w:r>
             <w:r>
               <w:rPr>
@@ -840,10 +852,11 @@
               <w:noProof/>
               <w:kern w:val="2"/>
               <w:sz w:val="24"/>
+              <w:lang/>
               <w14:ligatures w14:val="standardContextual"/>
             </w:rPr>
           </w:pPr>
-          <w:hyperlink w:anchor="_Toc214631494" w:history="1">
+          <w:hyperlink w:anchor="_Toc214661771" w:history="1">
             <w:r>
               <w:rPr>
                 <w:rStyle w:val="Hyperlink"/>
@@ -858,6 +871,7 @@
                 <w:noProof/>
                 <w:kern w:val="2"/>
                 <w:sz w:val="24"/>
+                <w:lang/>
                 <w14:ligatures w14:val="standardContextual"/>
               </w:rPr>
               <w:tab/>
@@ -889,7 +903,7 @@
                 <w:noProof/>
                 <w:webHidden/>
               </w:rPr>
-              <w:instrText xml:space="preserve"> PAGEREF _Toc214631494 \h </w:instrText>
+              <w:instrText xml:space="preserve"> PAGEREF _Toc214661771 \h </w:instrText>
             </w:r>
             <w:r>
               <w:rPr>
@@ -932,10 +946,11 @@
               <w:noProof/>
               <w:kern w:val="2"/>
               <w:sz w:val="24"/>
+              <w:lang/>
               <w14:ligatures w14:val="standardContextual"/>
             </w:rPr>
           </w:pPr>
-          <w:hyperlink w:anchor="_Toc214631495" w:history="1">
+          <w:hyperlink w:anchor="_Toc214661772" w:history="1">
             <w:r>
               <w:rPr>
                 <w:rStyle w:val="Hyperlink"/>
@@ -950,6 +965,7 @@
                 <w:noProof/>
                 <w:kern w:val="2"/>
                 <w:sz w:val="24"/>
+                <w:lang/>
                 <w14:ligatures w14:val="standardContextual"/>
               </w:rPr>
               <w:tab/>
@@ -981,7 +997,7 @@
                 <w:noProof/>
                 <w:webHidden/>
               </w:rPr>
-              <w:instrText xml:space="preserve"> PAGEREF _Toc214631495 \h </w:instrText>
+              <w:instrText xml:space="preserve"> PAGEREF _Toc214661772 \h </w:instrText>
             </w:r>
             <w:r>
               <w:rPr>
@@ -1001,7 +1017,7 @@
                 <w:noProof/>
                 <w:webHidden/>
               </w:rPr>
-              <w:t>4</w:t>
+              <w:t>5</w:t>
             </w:r>
             <w:r>
               <w:rPr>
@@ -1024,10 +1040,11 @@
               <w:noProof/>
               <w:kern w:val="2"/>
               <w:sz w:val="24"/>
+              <w:lang/>
               <w14:ligatures w14:val="standardContextual"/>
             </w:rPr>
           </w:pPr>
-          <w:hyperlink w:anchor="_Toc214631496" w:history="1">
+          <w:hyperlink w:anchor="_Toc214661773" w:history="1">
             <w:r>
               <w:rPr>
                 <w:rStyle w:val="Hyperlink"/>
@@ -1042,6 +1059,7 @@
                 <w:noProof/>
                 <w:kern w:val="2"/>
                 <w:sz w:val="24"/>
+                <w:lang/>
                 <w14:ligatures w14:val="standardContextual"/>
               </w:rPr>
               <w:tab/>
@@ -1073,7 +1091,7 @@
                 <w:noProof/>
                 <w:webHidden/>
               </w:rPr>
-              <w:instrText xml:space="preserve"> PAGEREF _Toc214631496 \h </w:instrText>
+              <w:instrText xml:space="preserve"> PAGEREF _Toc214661773 \h </w:instrText>
             </w:r>
             <w:r>
               <w:rPr>
@@ -1116,10 +1134,11 @@
               <w:noProof/>
               <w:kern w:val="2"/>
               <w:sz w:val="24"/>
+              <w:lang/>
               <w14:ligatures w14:val="standardContextual"/>
             </w:rPr>
           </w:pPr>
-          <w:hyperlink w:anchor="_Toc214631497" w:history="1">
+          <w:hyperlink w:anchor="_Toc214661774" w:history="1">
             <w:r>
               <w:rPr>
                 <w:rStyle w:val="Hyperlink"/>
@@ -1134,6 +1153,7 @@
                 <w:noProof/>
                 <w:kern w:val="2"/>
                 <w:sz w:val="24"/>
+                <w:lang/>
                 <w14:ligatures w14:val="standardContextual"/>
               </w:rPr>
               <w:tab/>
@@ -1165,7 +1185,7 @@
                 <w:noProof/>
                 <w:webHidden/>
               </w:rPr>
-              <w:instrText xml:space="preserve"> PAGEREF _Toc214631497 \h </w:instrText>
+              <w:instrText xml:space="preserve"> PAGEREF _Toc214661774 \h </w:instrText>
             </w:r>
             <w:r>
               <w:rPr>
@@ -1185,7 +1205,7 @@
                 <w:noProof/>
                 <w:webHidden/>
               </w:rPr>
-              <w:t>5</w:t>
+              <w:t>6</w:t>
             </w:r>
             <w:r>
               <w:rPr>
@@ -1208,10 +1228,11 @@
               <w:noProof/>
               <w:kern w:val="2"/>
               <w:sz w:val="24"/>
+              <w:lang/>
               <w14:ligatures w14:val="standardContextual"/>
             </w:rPr>
           </w:pPr>
-          <w:hyperlink w:anchor="_Toc214631498" w:history="1">
+          <w:hyperlink w:anchor="_Toc214661775" w:history="1">
             <w:r>
               <w:rPr>
                 <w:rStyle w:val="Hyperlink"/>
@@ -1226,6 +1247,7 @@
                 <w:noProof/>
                 <w:kern w:val="2"/>
                 <w:sz w:val="24"/>
+                <w:lang/>
                 <w14:ligatures w14:val="standardContextual"/>
               </w:rPr>
               <w:tab/>
@@ -1257,7 +1279,7 @@
                 <w:noProof/>
                 <w:webHidden/>
               </w:rPr>
-              <w:instrText xml:space="preserve"> PAGEREF _Toc214631498 \h </w:instrText>
+              <w:instrText xml:space="preserve"> PAGEREF _Toc214661775 \h </w:instrText>
             </w:r>
             <w:r>
               <w:rPr>
@@ -1277,7 +1299,7 @@
                 <w:noProof/>
                 <w:webHidden/>
               </w:rPr>
-              <w:t>6</w:t>
+              <w:t>7</w:t>
             </w:r>
             <w:r>
               <w:rPr>
@@ -1300,10 +1322,11 @@
               <w:noProof/>
               <w:kern w:val="2"/>
               <w:sz w:val="24"/>
+              <w:lang/>
               <w14:ligatures w14:val="standardContextual"/>
             </w:rPr>
           </w:pPr>
-          <w:hyperlink w:anchor="_Toc214631499" w:history="1">
+          <w:hyperlink w:anchor="_Toc214661776" w:history="1">
             <w:r>
               <w:rPr>
                 <w:rStyle w:val="Hyperlink"/>
@@ -1318,6 +1341,7 @@
                 <w:noProof/>
                 <w:kern w:val="2"/>
                 <w:sz w:val="24"/>
+                <w:lang/>
                 <w14:ligatures w14:val="standardContextual"/>
               </w:rPr>
               <w:tab/>
@@ -1349,7 +1373,7 @@
                 <w:noProof/>
                 <w:webHidden/>
               </w:rPr>
-              <w:instrText xml:space="preserve"> PAGEREF _Toc214631499 \h </w:instrText>
+              <w:instrText xml:space="preserve"> PAGEREF _Toc214661776 \h </w:instrText>
             </w:r>
             <w:r>
               <w:rPr>
@@ -1369,7 +1393,7 @@
                 <w:noProof/>
                 <w:webHidden/>
               </w:rPr>
-              <w:t>6</w:t>
+              <w:t>8</w:t>
             </w:r>
             <w:r>
               <w:rPr>
@@ -1388,10 +1412,11 @@
               <w:noProof/>
               <w:kern w:val="2"/>
               <w:sz w:val="24"/>
+              <w:lang/>
               <w14:ligatures w14:val="standardContextual"/>
             </w:rPr>
           </w:pPr>
-          <w:hyperlink w:anchor="_Toc214631500" w:history="1">
+          <w:hyperlink w:anchor="_Toc214661777" w:history="1">
             <w:r>
               <w:rPr>
                 <w:rStyle w:val="Hyperlink"/>
@@ -1406,6 +1431,7 @@
                 <w:noProof/>
                 <w:kern w:val="2"/>
                 <w:sz w:val="24"/>
+                <w:lang/>
                 <w14:ligatures w14:val="standardContextual"/>
               </w:rPr>
               <w:tab/>
@@ -1437,7 +1463,7 @@
                 <w:noProof/>
                 <w:webHidden/>
               </w:rPr>
-              <w:instrText xml:space="preserve"> PAGEREF _Toc214631500 \h </w:instrText>
+              <w:instrText xml:space="preserve"> PAGEREF _Toc214661777 \h </w:instrText>
             </w:r>
             <w:r>
               <w:rPr>
@@ -1457,7 +1483,7 @@
                 <w:noProof/>
                 <w:webHidden/>
               </w:rPr>
-              <w:t>7</w:t>
+              <w:t>9</w:t>
             </w:r>
             <w:r>
               <w:rPr>
@@ -1480,10 +1506,11 @@
               <w:noProof/>
               <w:kern w:val="2"/>
               <w:sz w:val="24"/>
+              <w:lang/>
               <w14:ligatures w14:val="standardContextual"/>
             </w:rPr>
           </w:pPr>
-          <w:hyperlink w:anchor="_Toc214631501" w:history="1">
+          <w:hyperlink w:anchor="_Toc214661778" w:history="1">
             <w:r>
               <w:rPr>
                 <w:rStyle w:val="Hyperlink"/>
@@ -1498,6 +1525,7 @@
                 <w:noProof/>
                 <w:kern w:val="2"/>
                 <w:sz w:val="24"/>
+                <w:lang/>
                 <w14:ligatures w14:val="standardContextual"/>
               </w:rPr>
               <w:tab/>
@@ -1529,7 +1557,7 @@
                 <w:noProof/>
                 <w:webHidden/>
               </w:rPr>
-              <w:instrText xml:space="preserve"> PAGEREF _Toc214631501 \h </w:instrText>
+              <w:instrText xml:space="preserve"> PAGEREF _Toc214661778 \h </w:instrText>
             </w:r>
             <w:r>
               <w:rPr>
@@ -1549,7 +1577,7 @@
                 <w:noProof/>
                 <w:webHidden/>
               </w:rPr>
-              <w:t>7</w:t>
+              <w:t>9</w:t>
             </w:r>
             <w:r>
               <w:rPr>
@@ -1572,10 +1600,11 @@
               <w:noProof/>
               <w:kern w:val="2"/>
               <w:sz w:val="24"/>
+              <w:lang/>
               <w14:ligatures w14:val="standardContextual"/>
             </w:rPr>
           </w:pPr>
-          <w:hyperlink w:anchor="_Toc214631502" w:history="1">
+          <w:hyperlink w:anchor="_Toc214661779" w:history="1">
             <w:r>
               <w:rPr>
                 <w:rStyle w:val="Hyperlink"/>
@@ -1590,6 +1619,7 @@
                 <w:noProof/>
                 <w:kern w:val="2"/>
                 <w:sz w:val="24"/>
+                <w:lang/>
                 <w14:ligatures w14:val="standardContextual"/>
               </w:rPr>
               <w:tab/>
@@ -1621,7 +1651,7 @@
                 <w:noProof/>
                 <w:webHidden/>
               </w:rPr>
-              <w:instrText xml:space="preserve"> PAGEREF _Toc214631502 \h </w:instrText>
+              <w:instrText xml:space="preserve"> PAGEREF _Toc214661779 \h </w:instrText>
             </w:r>
             <w:r>
               <w:rPr>
@@ -1641,7 +1671,7 @@
                 <w:noProof/>
                 <w:webHidden/>
               </w:rPr>
-              <w:t>9</w:t>
+              <w:t>11</w:t>
             </w:r>
             <w:r>
               <w:rPr>
@@ -1664,10 +1694,11 @@
               <w:noProof/>
               <w:kern w:val="2"/>
               <w:sz w:val="24"/>
+              <w:lang/>
               <w14:ligatures w14:val="standardContextual"/>
             </w:rPr>
           </w:pPr>
-          <w:hyperlink w:anchor="_Toc214631503" w:history="1">
+          <w:hyperlink w:anchor="_Toc214661780" w:history="1">
             <w:r>
               <w:rPr>
                 <w:rStyle w:val="Hyperlink"/>
@@ -1682,6 +1713,7 @@
                 <w:noProof/>
                 <w:kern w:val="2"/>
                 <w:sz w:val="24"/>
+                <w:lang/>
                 <w14:ligatures w14:val="standardContextual"/>
               </w:rPr>
               <w:tab/>
@@ -1713,7 +1745,7 @@
                 <w:noProof/>
                 <w:webHidden/>
               </w:rPr>
-              <w:instrText xml:space="preserve"> PAGEREF _Toc214631503 \h </w:instrText>
+              <w:instrText xml:space="preserve"> PAGEREF _Toc214661780 \h </w:instrText>
             </w:r>
             <w:r>
               <w:rPr>
@@ -1733,7 +1765,7 @@
                 <w:noProof/>
                 <w:webHidden/>
               </w:rPr>
-              <w:t>10</w:t>
+              <w:t>13</w:t>
             </w:r>
             <w:r>
               <w:rPr>
@@ -1756,10 +1788,11 @@
               <w:noProof/>
               <w:kern w:val="2"/>
               <w:sz w:val="24"/>
+              <w:lang/>
               <w14:ligatures w14:val="standardContextual"/>
             </w:rPr>
           </w:pPr>
-          <w:hyperlink w:anchor="_Toc214631504" w:history="1">
+          <w:hyperlink w:anchor="_Toc214661781" w:history="1">
             <w:r>
               <w:rPr>
                 <w:rStyle w:val="Hyperlink"/>
@@ -1774,6 +1807,7 @@
                 <w:noProof/>
                 <w:kern w:val="2"/>
                 <w:sz w:val="24"/>
+                <w:lang/>
                 <w14:ligatures w14:val="standardContextual"/>
               </w:rPr>
               <w:tab/>
@@ -1805,7 +1839,7 @@
                 <w:noProof/>
                 <w:webHidden/>
               </w:rPr>
-              <w:instrText xml:space="preserve"> PAGEREF _Toc214631504 \h </w:instrText>
+              <w:instrText xml:space="preserve"> PAGEREF _Toc214661781 \h </w:instrText>
             </w:r>
             <w:r>
               <w:rPr>
@@ -1825,7 +1859,7 @@
                 <w:noProof/>
                 <w:webHidden/>
               </w:rPr>
-              <w:t>11</w:t>
+              <w:t>14</w:t>
             </w:r>
             <w:r>
               <w:rPr>
@@ -1848,10 +1882,11 @@
               <w:noProof/>
               <w:kern w:val="2"/>
               <w:sz w:val="24"/>
+              <w:lang/>
               <w14:ligatures w14:val="standardContextual"/>
             </w:rPr>
           </w:pPr>
-          <w:hyperlink w:anchor="_Toc214631505" w:history="1">
+          <w:hyperlink w:anchor="_Toc214661782" w:history="1">
             <w:r>
               <w:rPr>
                 <w:rStyle w:val="Hyperlink"/>
@@ -1866,6 +1901,7 @@
                 <w:noProof/>
                 <w:kern w:val="2"/>
                 <w:sz w:val="24"/>
+                <w:lang/>
                 <w14:ligatures w14:val="standardContextual"/>
               </w:rPr>
               <w:tab/>
@@ -1876,7 +1912,7 @@
                 <w:rFonts w:eastAsiaTheme="majorEastAsia"/>
                 <w:noProof/>
               </w:rPr>
-              <w:t>Esp32 interconnect to stm32 and codec</w:t>
+              <w:t>ESP32 Interconnect to STM32 and Codec</w:t>
             </w:r>
             <w:r>
               <w:rPr>
@@ -1897,7 +1933,7 @@
                 <w:noProof/>
                 <w:webHidden/>
               </w:rPr>
-              <w:instrText xml:space="preserve"> PAGEREF _Toc214631505 \h </w:instrText>
+              <w:instrText xml:space="preserve"> PAGEREF _Toc214661782 \h </w:instrText>
             </w:r>
             <w:r>
               <w:rPr>
@@ -1917,7 +1953,7 @@
                 <w:noProof/>
                 <w:webHidden/>
               </w:rPr>
-              <w:t>12</w:t>
+              <w:t>15</w:t>
             </w:r>
             <w:r>
               <w:rPr>
@@ -1936,10 +1972,11 @@
               <w:noProof/>
               <w:kern w:val="2"/>
               <w:sz w:val="24"/>
+              <w:lang/>
               <w14:ligatures w14:val="standardContextual"/>
             </w:rPr>
           </w:pPr>
-          <w:hyperlink w:anchor="_Toc214631506" w:history="1">
+          <w:hyperlink w:anchor="_Toc214661783" w:history="1">
             <w:r>
               <w:rPr>
                 <w:rStyle w:val="Hyperlink"/>
@@ -1954,6 +1991,7 @@
                 <w:noProof/>
                 <w:kern w:val="2"/>
                 <w:sz w:val="24"/>
+                <w:lang/>
                 <w14:ligatures w14:val="standardContextual"/>
               </w:rPr>
               <w:tab/>
@@ -1985,7 +2023,7 @@
                 <w:noProof/>
                 <w:webHidden/>
               </w:rPr>
-              <w:instrText xml:space="preserve"> PAGEREF _Toc214631506 \h </w:instrText>
+              <w:instrText xml:space="preserve"> PAGEREF _Toc214661783 \h </w:instrText>
             </w:r>
             <w:r>
               <w:rPr>
@@ -2005,7 +2043,7 @@
                 <w:noProof/>
                 <w:webHidden/>
               </w:rPr>
-              <w:t>13</w:t>
+              <w:t>16</w:t>
             </w:r>
             <w:r>
               <w:rPr>
@@ -2028,10 +2066,11 @@
               <w:noProof/>
               <w:kern w:val="2"/>
               <w:sz w:val="24"/>
+              <w:lang/>
               <w14:ligatures w14:val="standardContextual"/>
             </w:rPr>
           </w:pPr>
-          <w:hyperlink w:anchor="_Toc214631507" w:history="1">
+          <w:hyperlink w:anchor="_Toc214661784" w:history="1">
             <w:r>
               <w:rPr>
                 <w:rStyle w:val="Hyperlink"/>
@@ -2046,6 +2085,7 @@
                 <w:noProof/>
                 <w:kern w:val="2"/>
                 <w:sz w:val="24"/>
+                <w:lang/>
                 <w14:ligatures w14:val="standardContextual"/>
               </w:rPr>
               <w:tab/>
@@ -2077,7 +2117,7 @@
                 <w:noProof/>
                 <w:webHidden/>
               </w:rPr>
-              <w:instrText xml:space="preserve"> PAGEREF _Toc214631507 \h </w:instrText>
+              <w:instrText xml:space="preserve"> PAGEREF _Toc214661784 \h </w:instrText>
             </w:r>
             <w:r>
               <w:rPr>
@@ -2097,7 +2137,7 @@
                 <w:noProof/>
                 <w:webHidden/>
               </w:rPr>
-              <w:t>13</w:t>
+              <w:t>16</w:t>
             </w:r>
             <w:r>
               <w:rPr>
@@ -2120,10 +2160,11 @@
               <w:noProof/>
               <w:kern w:val="2"/>
               <w:sz w:val="24"/>
+              <w:lang/>
               <w14:ligatures w14:val="standardContextual"/>
             </w:rPr>
           </w:pPr>
-          <w:hyperlink w:anchor="_Toc214631508" w:history="1">
+          <w:hyperlink w:anchor="_Toc214661785" w:history="1">
             <w:r>
               <w:rPr>
                 <w:rStyle w:val="Hyperlink"/>
@@ -2138,6 +2179,7 @@
                 <w:noProof/>
                 <w:kern w:val="2"/>
                 <w:sz w:val="24"/>
+                <w:lang/>
                 <w14:ligatures w14:val="standardContextual"/>
               </w:rPr>
               <w:tab/>
@@ -2169,7 +2211,7 @@
                 <w:noProof/>
                 <w:webHidden/>
               </w:rPr>
-              <w:instrText xml:space="preserve"> PAGEREF _Toc214631508 \h </w:instrText>
+              <w:instrText xml:space="preserve"> PAGEREF _Toc214661785 \h </w:instrText>
             </w:r>
             <w:r>
               <w:rPr>
@@ -2189,7 +2231,7 @@
                 <w:noProof/>
                 <w:webHidden/>
               </w:rPr>
-              <w:t>14</w:t>
+              <w:t>17</w:t>
             </w:r>
             <w:r>
               <w:rPr>
@@ -2208,10 +2250,11 @@
               <w:noProof/>
               <w:kern w:val="2"/>
               <w:sz w:val="24"/>
+              <w:lang/>
               <w14:ligatures w14:val="standardContextual"/>
             </w:rPr>
           </w:pPr>
-          <w:hyperlink w:anchor="_Toc214631509" w:history="1">
+          <w:hyperlink w:anchor="_Toc214661786" w:history="1">
             <w:r>
               <w:rPr>
                 <w:rStyle w:val="Hyperlink"/>
@@ -2226,6 +2269,7 @@
                 <w:noProof/>
                 <w:kern w:val="2"/>
                 <w:sz w:val="24"/>
+                <w:lang/>
                 <w14:ligatures w14:val="standardContextual"/>
               </w:rPr>
               <w:tab/>
@@ -2257,7 +2301,7 @@
                 <w:noProof/>
                 <w:webHidden/>
               </w:rPr>
-              <w:instrText xml:space="preserve"> PAGEREF _Toc214631509 \h </w:instrText>
+              <w:instrText xml:space="preserve"> PAGEREF _Toc214661786 \h </w:instrText>
             </w:r>
             <w:r>
               <w:rPr>
@@ -2277,7 +2321,7 @@
                 <w:noProof/>
                 <w:webHidden/>
               </w:rPr>
-              <w:t>14</w:t>
+              <w:t>18</w:t>
             </w:r>
             <w:r>
               <w:rPr>
@@ -2296,10 +2340,11 @@
               <w:noProof/>
               <w:kern w:val="2"/>
               <w:sz w:val="24"/>
+              <w:lang/>
               <w14:ligatures w14:val="standardContextual"/>
             </w:rPr>
           </w:pPr>
-          <w:hyperlink w:anchor="_Toc214631510" w:history="1">
+          <w:hyperlink w:anchor="_Toc214661787" w:history="1">
             <w:r>
               <w:rPr>
                 <w:rStyle w:val="Hyperlink"/>
@@ -2314,6 +2359,7 @@
                 <w:noProof/>
                 <w:kern w:val="2"/>
                 <w:sz w:val="24"/>
+                <w:lang/>
                 <w14:ligatures w14:val="standardContextual"/>
               </w:rPr>
               <w:tab/>
@@ -2324,7 +2370,7 @@
                 <w:rFonts w:eastAsiaTheme="majorEastAsia"/>
                 <w:noProof/>
               </w:rPr>
-              <w:t>Abstract</w:t>
+              <w:t>Project management</w:t>
             </w:r>
             <w:r>
               <w:rPr>
@@ -2345,7 +2391,7 @@
                 <w:noProof/>
                 <w:webHidden/>
               </w:rPr>
-              <w:instrText xml:space="preserve"> PAGEREF _Toc214631510 \h </w:instrText>
+              <w:instrText xml:space="preserve"> PAGEREF _Toc214661787 \h </w:instrText>
             </w:r>
             <w:r>
               <w:rPr>
@@ -2365,95 +2411,7 @@
                 <w:noProof/>
                 <w:webHidden/>
               </w:rPr>
-              <w:t>15</w:t>
-            </w:r>
-            <w:r>
-              <w:rPr>
-                <w:noProof/>
-                <w:webHidden/>
-              </w:rPr>
-              <w:fldChar w:fldCharType="end"/>
-            </w:r>
-          </w:hyperlink>
-        </w:p>
-        <w:p>
-          <w:pPr>
-            <w:pStyle w:val="TOC1"/>
-            <w:rPr>
-              <w:rFonts w:asciiTheme="minorHAnsi" w:eastAsiaTheme="minorEastAsia" w:hAnsiTheme="minorHAnsi" w:cstheme="minorBidi"/>
-              <w:noProof/>
-              <w:kern w:val="2"/>
-              <w:sz w:val="24"/>
-              <w14:ligatures w14:val="standardContextual"/>
-            </w:rPr>
-          </w:pPr>
-          <w:hyperlink w:anchor="_Toc214631511" w:history="1">
-            <w:r>
-              <w:rPr>
-                <w:rStyle w:val="Hyperlink"/>
-                <w:rFonts w:eastAsiaTheme="majorEastAsia"/>
-                <w:noProof/>
-              </w:rPr>
-              <w:t>7.</w:t>
-            </w:r>
-            <w:r>
-              <w:rPr>
-                <w:rFonts w:asciiTheme="minorHAnsi" w:eastAsiaTheme="minorEastAsia" w:hAnsiTheme="minorHAnsi" w:cstheme="minorBidi"/>
-                <w:noProof/>
-                <w:kern w:val="2"/>
-                <w:sz w:val="24"/>
-                <w14:ligatures w14:val="standardContextual"/>
-              </w:rPr>
-              <w:tab/>
-            </w:r>
-            <w:r>
-              <w:rPr>
-                <w:rStyle w:val="Hyperlink"/>
-                <w:rFonts w:eastAsiaTheme="majorEastAsia"/>
-                <w:noProof/>
-              </w:rPr>
-              <w:t>Proposed Content</w:t>
-            </w:r>
-            <w:r>
-              <w:rPr>
-                <w:noProof/>
-                <w:webHidden/>
-              </w:rPr>
-              <w:tab/>
-            </w:r>
-            <w:r>
-              <w:rPr>
-                <w:noProof/>
-                <w:webHidden/>
-              </w:rPr>
-              <w:fldChar w:fldCharType="begin"/>
-            </w:r>
-            <w:r>
-              <w:rPr>
-                <w:noProof/>
-                <w:webHidden/>
-              </w:rPr>
-              <w:instrText xml:space="preserve"> PAGEREF _Toc214631511 \h </w:instrText>
-            </w:r>
-            <w:r>
-              <w:rPr>
-                <w:noProof/>
-                <w:webHidden/>
-              </w:rPr>
-            </w:r>
-            <w:r>
-              <w:rPr>
-                <w:noProof/>
-                <w:webHidden/>
-              </w:rPr>
-              <w:fldChar w:fldCharType="separate"/>
-            </w:r>
-            <w:r>
-              <w:rPr>
-                <w:noProof/>
-                <w:webHidden/>
-              </w:rPr>
-              <w:t>15</w:t>
+              <w:t>18</w:t>
             </w:r>
             <w:r>
               <w:rPr>
@@ -2496,7 +2454,7 @@
       <w:pPr>
         <w:pStyle w:val="Heading1"/>
       </w:pPr>
-      <w:bookmarkStart w:id="1" w:name="_Toc214631492"/>
+      <w:bookmarkStart w:id="1" w:name="_Toc214661769"/>
       <w:r>
         <w:lastRenderedPageBreak/>
         <w:t>Introduction</w:t>
@@ -2555,7 +2513,7 @@
         <w:pStyle w:val="Heading1"/>
         <w:jc w:val="left"/>
       </w:pPr>
-      <w:bookmarkStart w:id="2" w:name="_Toc214631493"/>
+      <w:bookmarkStart w:id="2" w:name="_Toc214661770"/>
       <w:r>
         <w:t>Specifications</w:t>
       </w:r>
@@ -2573,7 +2531,7 @@
       <w:pPr>
         <w:pStyle w:val="Heading2"/>
       </w:pPr>
-      <w:bookmarkStart w:id="3" w:name="_Toc214631494"/>
+      <w:bookmarkStart w:id="3" w:name="_Toc214661771"/>
       <w:r>
         <w:t>Purpose of the System</w:t>
       </w:r>
@@ -2581,18 +2539,25 @@
     </w:p>
     <w:p>
       <w:r>
-        <w:rPr>
-          <w:highlight w:val="yellow"/>
-        </w:rPr>
-        <w:t>Text</w:t>
+        <w:t>The system can receive audio from either the on-board microphone or a conventional line-level input. After amplification and analog filtering, the signal is fed into the CS4271 codec, which converts it into a digital data stream. This digital audio is transferred to the STM32F429 microcontroller, where it is processed and used to drive the lighting control algorithms. In parallel, the audio path continues through the codec’s DAC, generating an analog output that is made available on the line-out connector and the headphone jack.</w:t>
+      </w:r>
+    </w:p>
+    <w:p>
+      <w:pPr>
+        <w:spacing w:before="0" w:after="160" w:line="259" w:lineRule="auto"/>
+        <w:jc w:val="left"/>
+      </w:pPr>
+      <w:r>
+        <w:br w:type="page"/>
       </w:r>
     </w:p>
     <w:p>
       <w:pPr>
         <w:pStyle w:val="Heading2"/>
       </w:pPr>
-      <w:bookmarkStart w:id="4" w:name="_Toc214631495"/>
-      <w:r>
+      <w:bookmarkStart w:id="4" w:name="_Toc214661772"/>
+      <w:r>
+        <w:lastRenderedPageBreak/>
         <w:t>Basic</w:t>
       </w:r>
       <w:r>
@@ -2803,7 +2768,6 @@
           <w:sz w:val="22"/>
           <w:lang w:eastAsia="de-DE"/>
         </w:rPr>
-        <w:lastRenderedPageBreak/>
         <w:t>Generating DMX512 frames at 250 kbit/s using the microcontroller’s integrated UART</w:t>
       </w:r>
     </w:p>
@@ -2811,7 +2775,7 @@
       <w:pPr>
         <w:pStyle w:val="Heading2"/>
       </w:pPr>
-      <w:bookmarkStart w:id="5" w:name="_Toc214631496"/>
+      <w:bookmarkStart w:id="5" w:name="_Toc214661773"/>
       <w:r>
         <w:t>Optional Functions</w:t>
       </w:r>
@@ -2946,10 +2910,20 @@
     </w:p>
     <w:p>
       <w:pPr>
+        <w:spacing w:before="0" w:after="160" w:line="259" w:lineRule="auto"/>
+        <w:jc w:val="left"/>
+      </w:pPr>
+      <w:r>
+        <w:br w:type="page"/>
+      </w:r>
+    </w:p>
+    <w:p>
+      <w:pPr>
         <w:pStyle w:val="Heading2"/>
       </w:pPr>
-      <w:bookmarkStart w:id="6" w:name="_Toc214631497"/>
-      <w:r>
+      <w:bookmarkStart w:id="6" w:name="_Toc214661774"/>
+      <w:r>
+        <w:lastRenderedPageBreak/>
         <w:t>System Specifications</w:t>
       </w:r>
       <w:bookmarkEnd w:id="6"/>
@@ -3216,7 +3190,6 @@
         <w:jc w:val="left"/>
       </w:pPr>
       <w:r>
-        <w:lastRenderedPageBreak/>
         <w:t>Audio Interface</w:t>
       </w:r>
       <w:r>
@@ -3407,10 +3380,20 @@
     </w:p>
     <w:p>
       <w:pPr>
+        <w:spacing w:before="0" w:after="160" w:line="259" w:lineRule="auto"/>
+        <w:jc w:val="left"/>
+      </w:pPr>
+      <w:r>
+        <w:br w:type="page"/>
+      </w:r>
+    </w:p>
+    <w:p>
+      <w:pPr>
         <w:pStyle w:val="Heading2"/>
       </w:pPr>
-      <w:bookmarkStart w:id="7" w:name="_Toc214631498"/>
-      <w:r>
+      <w:bookmarkStart w:id="7" w:name="_Toc214661775"/>
+      <w:r>
+        <w:lastRenderedPageBreak/>
         <w:t>User Interface and User Interaction</w:t>
       </w:r>
       <w:bookmarkEnd w:id="7"/>
@@ -3753,43 +3736,32 @@
         <w:br/>
       </w:r>
       <w:r>
-        <w:t xml:space="preserve">All remaining interactions—such as managing Bluetooth connections, adjusting light-control settings, and accessing additional features—are handled through a touch display. This interface provides flexibility and can be fully defined during firmware development. It is </w:t>
-      </w:r>
+        <w:t>All remaining interactions—such as managing Bluetooth connections, adjusting light-control settings, and accessing additional features—are handled through a touch display. This interface provides flexibility and can be fully defined during firmware development. It is designed to cover all necessary user interactions, so no further hardware controls are required.</w:t>
+      </w:r>
+    </w:p>
+    <w:p>
+      <w:pPr>
+        <w:spacing w:before="0" w:after="160" w:line="259" w:lineRule="auto"/>
+        <w:jc w:val="left"/>
+      </w:pPr>
+      <w:r>
+        <w:br w:type="page"/>
+      </w:r>
+    </w:p>
+    <w:p>
+      <w:pPr>
+        <w:pStyle w:val="Heading2"/>
+      </w:pPr>
+      <w:bookmarkStart w:id="8" w:name="_Toc214661776"/>
       <w:r>
         <w:lastRenderedPageBreak/>
-        <w:t>designed to cover all necessary user interactions, so no further hardware controls are required.</w:t>
-      </w:r>
-    </w:p>
-    <w:p>
-      <w:pPr>
-        <w:pStyle w:val="Heading2"/>
-      </w:pPr>
-      <w:bookmarkStart w:id="8" w:name="_Toc214631499"/>
-      <w:r>
         <w:t>Functional Block Diagram</w:t>
       </w:r>
       <w:bookmarkEnd w:id="8"/>
     </w:p>
     <w:p>
       <w:r>
-        <w:rPr>
-          <w:highlight w:val="yellow"/>
-        </w:rPr>
-        <w:t>INSERT BLOCK DIAGRAM</w:t>
-      </w:r>
-    </w:p>
-    <w:p>
-      <w:r>
-        <w:t xml:space="preserve">The functional block diagram in </w:t>
-      </w:r>
-      <w:r>
-        <w:rPr>
-          <w:highlight w:val="yellow"/>
-        </w:rPr>
-        <w:t>Figure 1</w:t>
-      </w:r>
-      <w:r>
-        <w:t xml:space="preserve"> illustrates the complete signal flow within the hardware system. It shows the path from the audio input, through the microcontroller and audio codec, to the analog audio output and the DMX lighting output. The standard analog signal path is shown in blue, while the optional Bluetooth signal path is shown in green.</w:t>
+        <w:t>The functional block diagram in illustrates the complete signal flow within the hardware system. It shows the path from the audio input, through the microcontroller and audio codec, to the analog audio output and the DMX lighting output.</w:t>
       </w:r>
     </w:p>
     <w:p>
@@ -3857,47 +3829,47 @@
         <w:t>2</w:t>
       </w:r>
       <w:r>
-        <w:t xml:space="preserve">S. After processing, the STM32 returns the audio to the codec for conversion and output, or back to the ESP32 for wireless transmission. It is </w:t>
+        <w:t>S. After processing, the STM32 returns the audio to the codec for conversion and output, or back to the ESP32 for wireless transmission. It is also possible to use Bluetooth only as an input or only as an output, combining the analog and digital paths as needed.</w:t>
+      </w:r>
+    </w:p>
+    <w:p>
+      <w:r>
+        <w:t>A second communication option between the ESP32 and STM32 was added as a design-time precaution. During PCB design, it was uncertain whether the primary ESP32-to-STM32 I</w:t>
+      </w:r>
+      <w:r>
+        <w:rPr>
+          <w:vertAlign w:val="superscript"/>
+        </w:rPr>
+        <w:t>2</w:t>
+      </w:r>
+      <w:r>
+        <w:t xml:space="preserve">S link would work reliably, and the project timeline did not allow for a redesign if problems appeared. Therefore, an alternative scheme was included: the ESP32 can interface directly with the </w:t>
       </w:r>
       <w:r>
         <w:lastRenderedPageBreak/>
-        <w:t>also possible to use Bluetooth only as an input or only as an output, combining the analog and digital paths as needed.</w:t>
-      </w:r>
-    </w:p>
-    <w:p>
-      <w:r>
-        <w:t>A second communication option between the ESP32 and STM32 was added as a design-time precaution. During PCB design, it was uncertain whether the primary ESP32-to-STM32 I</w:t>
+        <w:t xml:space="preserve">codec over </w:t>
       </w:r>
       <w:r>
         <w:rPr>
           <w:vertAlign w:val="superscript"/>
         </w:rPr>
+        <w:t>I</w:t>
+      </w:r>
+      <w:r>
+        <w:rPr>
+          <w:vertAlign w:val="superscript"/>
+        </w:rPr>
         <w:t>2</w:t>
       </w:r>
       <w:r>
-        <w:t xml:space="preserve">S link would work reliably, and the project timeline did not allow for a redesign if problems appeared. Therefore, an alternative scheme was included: the ESP32 can interface directly with the codec over </w:t>
-      </w:r>
-      <w:r>
-        <w:rPr>
-          <w:vertAlign w:val="superscript"/>
-        </w:rPr>
-        <w:t>I</w:t>
-      </w:r>
-      <w:r>
-        <w:rPr>
-          <w:vertAlign w:val="superscript"/>
-        </w:rPr>
-        <w:t>2</w:t>
-      </w:r>
-      <w:r>
-        <w:t>S, while a separate UART link handles communication with the STM32. Only one of these schemes is used in practice. In the block diagram, the optional fallback path is shown with dashed lines.</w:t>
+        <w:t>S, while a separate UART link handles communication with the STM32. Only one of these schemes is used in practice.</w:t>
       </w:r>
     </w:p>
     <w:p>
       <w:pPr>
         <w:pStyle w:val="Heading1"/>
       </w:pPr>
-      <w:bookmarkStart w:id="9" w:name="_Toc214631500"/>
+      <w:bookmarkStart w:id="9" w:name="_Toc214661777"/>
       <w:r>
         <w:t>Development</w:t>
       </w:r>
@@ -4068,7 +4040,7 @@
       <w:pPr>
         <w:pStyle w:val="Heading2"/>
       </w:pPr>
-      <w:bookmarkStart w:id="10" w:name="_Toc214631501"/>
+      <w:bookmarkStart w:id="10" w:name="_Toc214661778"/>
       <w:r>
         <w:t>Implementation of a Dedicated 3.3 V Rail for the ESP32</w:t>
       </w:r>
@@ -4120,10 +4092,10 @@
         <w:t xml:space="preserve">To address this, we added a second 3.3 V regulator dedicated exclusively to the ESP32 (see </w:t>
       </w:r>
       <w:r>
-        <w:rPr>
-          <w:highlight w:val="yellow"/>
-        </w:rPr>
-        <w:t>Figure 2</w:t>
+        <w:t>Figure</w:t>
+      </w:r>
+      <w:r>
+        <w:t xml:space="preserve"> below</w:t>
       </w:r>
       <w:r>
         <w:t>). Splitting the load across two regulators provides sufficient current headroom, avoids overload, and reduces thermal stress. It also improves stability for the ESP32, whose wireless transmissions can cause rapid and significant current spikes.</w:t>
@@ -4188,10 +4160,10 @@
         <w:t xml:space="preserve">To further smooth these current spikes, we added substantial decoupling capacitance to the dedicated ESP32 rail (see </w:t>
       </w:r>
       <w:r>
-        <w:rPr>
-          <w:highlight w:val="yellow"/>
-        </w:rPr>
-        <w:t>Figure 3</w:t>
+        <w:t xml:space="preserve">Figure </w:t>
+      </w:r>
+      <w:r>
+        <w:t>below</w:t>
       </w:r>
       <w:r>
         <w:t>). Capacitors were placed both at the regulator output and close to the ESP32 power pins. This local energy buffering reduces high-frequency fluctuations, stabilizes the supply during wireless bursts, and increases the overall reliability of the power distribution network.</w:t>
@@ -4262,7 +4234,7 @@
       <w:pPr>
         <w:pStyle w:val="Heading2"/>
       </w:pPr>
-      <w:bookmarkStart w:id="11" w:name="_Toc214631502"/>
+      <w:bookmarkStart w:id="11" w:name="_Toc214661779"/>
       <w:r>
         <w:lastRenderedPageBreak/>
         <w:t>Analog input and filtering</w:t>
@@ -4271,22 +4243,28 @@
     </w:p>
     <w:p>
       <w:r>
-        <w:t>The audio input stage supports a microphone and 3.5mm jack audio signals. These are then selected by a switch that lets either the jack signal or the microphone signal pass through into the volume control. A SEL_M_J signal has been connected to the switch which will be read out by the stm32 microcontroller, this way it knows whether the jack audio or the mic audio is passing through.</w:t>
-      </w:r>
-    </w:p>
-    <w:p>
-      <w:r>
-        <w:rPr>
-          <w:noProof/>
-        </w:rPr>
+        <w:t xml:space="preserve">The audio input stage (see </w:t>
+      </w:r>
+      <w:r>
+        <w:t xml:space="preserve">Figure </w:t>
+      </w:r>
+      <w:r>
+        <w:t>below</w:t>
+      </w:r>
+      <w:r>
+        <w:t>) supports two analog sources: the on-board microphone and a 3.5 mm audio jack. A selection switch allows either the microphone signal or the jack signal to be routed to the volume control stage. The switch position is monitored by the STM32 through the SEL_M_J signal, enabling the firmware to determine which source is currently active.</w:t>
+      </w:r>
+    </w:p>
+    <w:p>
+      <w:r>
         <w:drawing>
-          <wp:anchor distT="0" distB="0" distL="114300" distR="114300" simplePos="0" relativeHeight="251662336" behindDoc="0" locked="0" layoutInCell="1" allowOverlap="1" wp14:anchorId="0C920A4C" wp14:editId="685CDD8F">
+          <wp:anchor distT="0" distB="0" distL="114300" distR="114300" simplePos="0" relativeHeight="251662336" behindDoc="0" locked="0" layoutInCell="1" allowOverlap="1" wp14:anchorId="0C920A4C" wp14:editId="788CF16F">
             <wp:simplePos x="0" y="0"/>
             <wp:positionH relativeFrom="margin">
-              <wp:posOffset>232654</wp:posOffset>
+              <wp:posOffset>232410</wp:posOffset>
             </wp:positionH>
             <wp:positionV relativeFrom="paragraph">
-              <wp:posOffset>566811</wp:posOffset>
+              <wp:posOffset>722354</wp:posOffset>
             </wp:positionV>
             <wp:extent cx="5289550" cy="2407920"/>
             <wp:effectExtent l="0" t="0" r="6350" b="0"/>
@@ -4331,115 +4309,43 @@
         </w:drawing>
       </w:r>
       <w:r>
-        <w:t>The Volume control has simply been implemented with a single 50k stereo potentiometer, this way both signals are always the same “loudness” or in other terms the same amplitude.</w:t>
-      </w:r>
-    </w:p>
-    <w:p>
-      <w:r>
-        <w:t xml:space="preserve">After the volume control the </w:t>
+        <w:t xml:space="preserve">The </w:t>
+      </w:r>
+      <w:r>
+        <w:t>input</w:t>
+      </w:r>
+      <w:r>
+        <w:t xml:space="preserve"> volume control is implemented using a single 50 </w:t>
       </w:r>
       <w:proofErr w:type="spellStart"/>
       <w:r>
-        <w:t>singals</w:t>
+        <w:t>kΩ</w:t>
       </w:r>
       <w:proofErr w:type="spellEnd"/>
       <w:r>
-        <w:t xml:space="preserve"> travel to the analog input filter before the codec. This is not only a filter, because it also conditions the signal so that it arrives to the codec as its expected. First its dc part is removed with the input capacitors and thereafter they are centered around the VCOM reference voltage buffered by the </w:t>
-      </w:r>
-      <w:proofErr w:type="spellStart"/>
-      <w:r>
-        <w:t>opamp</w:t>
-      </w:r>
-      <w:proofErr w:type="spellEnd"/>
-      <w:r>
-        <w:t>. This reference voltage is sourced by the codec itself.</w:t>
-      </w:r>
-    </w:p>
-    <w:p>
-      <w:proofErr w:type="spellStart"/>
-      <w:r>
-        <w:t>Unfortunatley</w:t>
-      </w:r>
-      <w:proofErr w:type="spellEnd"/>
-      <w:r>
-        <w:t xml:space="preserve"> during schematic design we made a mistake and </w:t>
-      </w:r>
-      <w:proofErr w:type="spellStart"/>
-      <w:r>
-        <w:t>accidentaly</w:t>
-      </w:r>
-      <w:proofErr w:type="spellEnd"/>
-      <w:r>
-        <w:t xml:space="preserve"> named the signal flags the same before and after the buffering amplifier, causing the amplifier to load the </w:t>
-      </w:r>
-      <w:proofErr w:type="spellStart"/>
-      <w:r>
-        <w:t>vcom</w:t>
-      </w:r>
-      <w:proofErr w:type="spellEnd"/>
-      <w:r>
-        <w:t xml:space="preserve"> supply by the codec instead of buffering it. We realized this when we measured the signal on the filters output, which showed clipping on the lower part of the signal indicating the offset given by the </w:t>
-      </w:r>
-      <w:proofErr w:type="spellStart"/>
-      <w:r>
-        <w:t>vcom</w:t>
-      </w:r>
-      <w:proofErr w:type="spellEnd"/>
-      <w:r>
-        <w:t xml:space="preserve"> reference voltage is not where it is supposed to be at 2.5V.</w:t>
-      </w:r>
-    </w:p>
-    <w:p/>
-    <w:p>
-      <w:r>
-        <w:t>INSERT PICTURE OF CLIPPED SIGNAL HERE</w:t>
-      </w:r>
-    </w:p>
-    <w:p/>
-    <w:p>
-      <w:r>
-        <w:t xml:space="preserve">after cutting some traces and connecting certain parts with </w:t>
-      </w:r>
-      <w:proofErr w:type="spellStart"/>
-      <w:r>
-        <w:t>ennameled</w:t>
-      </w:r>
-      <w:proofErr w:type="spellEnd"/>
-      <w:r>
-        <w:t xml:space="preserve"> </w:t>
-      </w:r>
-      <w:proofErr w:type="spellStart"/>
-      <w:r>
-        <w:t>bodge</w:t>
-      </w:r>
-      <w:proofErr w:type="spellEnd"/>
-      <w:r>
-        <w:t xml:space="preserve"> wire the filter is </w:t>
-      </w:r>
-      <w:proofErr w:type="spellStart"/>
-      <w:r>
-        <w:t>fuly</w:t>
-      </w:r>
-      <w:proofErr w:type="spellEnd"/>
-      <w:r>
-        <w:t xml:space="preserve"> </w:t>
-      </w:r>
-      <w:proofErr w:type="spellStart"/>
-      <w:r>
-        <w:t>funcitonal</w:t>
-      </w:r>
-      <w:proofErr w:type="spellEnd"/>
-      <w:r>
-        <w:t>. For further details see The Hardware test report in the appendix.</w:t>
-      </w:r>
-    </w:p>
-    <w:p/>
-    <w:p>
-      <w:r>
-        <w:t>INSERT PICTURE OF FIXED SIGNAL HERE</w:t>
-      </w:r>
-    </w:p>
-    <w:p/>
+        <w:t xml:space="preserve"> stereo potentiometer. Using a stereo component ensures that both audio channels maintain identical gain settings, keeping the input signal levels balanced.</w:t>
+      </w:r>
+    </w:p>
+    <w:p>
+      <w:r>
+        <w:t xml:space="preserve">After the volume control, the signal is passed to the analog input filter in front of the codec (see </w:t>
+      </w:r>
+      <w:r>
+        <w:t xml:space="preserve">Figure </w:t>
+      </w:r>
+      <w:r>
+        <w:t>below</w:t>
+      </w:r>
+      <w:r>
+        <w:t>). This stage does more than simple filtering</w:t>
+      </w:r>
+      <w:r>
+        <w:t xml:space="preserve"> – I</w:t>
+      </w:r>
+      <w:r>
+        <w:t>t also prepares and conditions the signal so that it matches the input requirements of the codec. First, the DC component is removed using coupling capacitors. The signal is then shifted and centered around the codec’s VCOM reference voltage using an op-amp buffer. The VCOM reference itself is generated internally by the codec.</w:t>
+      </w:r>
+    </w:p>
     <w:p>
       <w:pPr>
         <w:rPr>
@@ -4452,7 +4358,7 @@
         </w:rPr>
         <w:lastRenderedPageBreak/>
         <w:drawing>
-          <wp:anchor distT="0" distB="0" distL="114300" distR="114300" simplePos="0" relativeHeight="251664384" behindDoc="0" locked="0" layoutInCell="1" allowOverlap="1" wp14:anchorId="07547C2D" wp14:editId="2A074897">
+          <wp:anchor distT="0" distB="0" distL="114300" distR="114300" simplePos="0" relativeHeight="251670528" behindDoc="0" locked="0" layoutInCell="1" allowOverlap="1" wp14:anchorId="3D87D68F" wp14:editId="1F3EF3E2">
             <wp:simplePos x="0" y="0"/>
             <wp:positionH relativeFrom="column">
               <wp:posOffset>-62767</wp:posOffset>
@@ -4501,194 +4407,222 @@
     <w:p/>
     <w:p>
       <w:r>
-        <w:t xml:space="preserve">The analog frontend has been designed according to our teachers guidelines and the CODEC datasheet. Thereafter it has been simulated in </w:t>
+        <w:t xml:space="preserve">The analog front end was designed based on the instructors’ guidelines and the codec datasheet, and subsequently simulated in </w:t>
       </w:r>
       <w:proofErr w:type="spellStart"/>
       <w:r>
-        <w:t>Ltspice</w:t>
+        <w:t>LTspice</w:t>
       </w:r>
       <w:proofErr w:type="spellEnd"/>
       <w:r>
-        <w:t xml:space="preserve"> to see its function.</w:t>
-      </w:r>
-    </w:p>
-    <w:p/>
-    <w:p>
-      <w:r>
-        <w:t>INSERT LTSPICE PIC HERE</w:t>
-      </w:r>
-    </w:p>
-    <w:p>
-      <w:pPr>
-        <w:pStyle w:val="Heading2"/>
-      </w:pPr>
-      <w:bookmarkStart w:id="12" w:name="_Toc214631503"/>
-      <w:r>
-        <w:t>Codec circuitry and configuration</w:t>
-      </w:r>
-      <w:bookmarkEnd w:id="12"/>
-    </w:p>
-    <w:p>
-      <w:r>
-        <w:t>The codec circuitry was quite straightforward, it was mostly a copy paste form the datasheet. The only thing we truly had to configure ourselves is the M0 and M1 pins via pull up or pull down resistors. As we did not want to commit to a single configuration, we decided to add the footprints for the resistors to either pull up or pull down depending on how we would like to use the codec.</w:t>
-      </w:r>
-    </w:p>
-    <w:p>
-      <w:r>
-        <w:t xml:space="preserve">For normal use we went </w:t>
+        <w:t xml:space="preserve"> to verify correct </w:t>
+      </w:r>
+      <w:r>
+        <w:t xml:space="preserve">behavior (see </w:t>
+      </w:r>
+      <w:r>
+        <w:t>Appendix</w:t>
+      </w:r>
+      <w:r>
+        <w:t>).</w:t>
+      </w:r>
+    </w:p>
+    <w:p>
+      <w:r>
+        <w:t xml:space="preserve">Unfortunately </w:t>
+      </w:r>
+      <w:r>
+        <w:t>an error was introduced</w:t>
+      </w:r>
+      <w:r>
+        <w:t xml:space="preserve"> </w:t>
+      </w:r>
+      <w:r>
+        <w:t>d</w:t>
+      </w:r>
+      <w:r>
+        <w:t xml:space="preserve">uring schematic design: the signal nets before and after the VCOM buffer amplifier were given the same name. As a result, the buffer output was </w:t>
+      </w:r>
+      <w:r>
+        <w:t>unwittingly</w:t>
+      </w:r>
+      <w:r>
+        <w:t xml:space="preserve"> </w:t>
+      </w:r>
+      <w:r>
+        <w:t>tied directly to the codec’s VCOM pin, causing the amplifier to load the reference supply instead of buffering it. This issue became visible during measurements, where the filter output showed clipping on the lower part of the waveform, indicating that the VCOM reference was not at its intended 2.5 V level (</w:t>
+      </w:r>
+      <w:r>
+        <w:t xml:space="preserve">see Figure </w:t>
+      </w:r>
+      <w:r>
+        <w:t>below</w:t>
+      </w:r>
+      <w:r>
+        <w:t>).</w:t>
+      </w:r>
+    </w:p>
+    <w:p>
+      <w:r>
+        <w:t xml:space="preserve">The issue was resolved by cutting the incorrect PCB traces and reconnecting the affected signals using enameled </w:t>
       </w:r>
       <w:proofErr w:type="spellStart"/>
       <w:r>
-        <w:t>witht</w:t>
+        <w:t>bodge</w:t>
       </w:r>
       <w:proofErr w:type="spellEnd"/>
       <w:r>
-        <w:t xml:space="preserve"> the following </w:t>
-      </w:r>
-      <w:proofErr w:type="spellStart"/>
-      <w:r>
-        <w:t>condiguration</w:t>
-      </w:r>
-      <w:proofErr w:type="spellEnd"/>
-      <w:r>
-        <w:t>: M0 = ‘1’, M1 = ‘0’</w:t>
-      </w:r>
-    </w:p>
-    <w:p>
-      <w:pPr>
-        <w:rPr>
-          <w:noProof/>
-        </w:rPr>
-      </w:pPr>
-      <w:r>
-        <w:rPr>
-          <w:noProof/>
-        </w:rPr>
+        <w:t xml:space="preserve"> wires. After this correction, the analog filter and input stage operate as intended (see Figure </w:t>
+      </w:r>
+      <w:r>
+        <w:t>below</w:t>
+      </w:r>
+      <w:r>
+        <w:t xml:space="preserve">). Further details </w:t>
+      </w:r>
+      <w:r>
+        <w:t xml:space="preserve">related to the correction and measurement results </w:t>
+      </w:r>
+      <w:r>
+        <w:t>are documented in the Hardware Test Report in the appendix.</w:t>
+      </w:r>
+    </w:p>
+    <w:p>
+      <w:pPr>
+        <w:rPr>
+          <w:lang/>
+        </w:rPr>
+      </w:pPr>
+      <w:r>
+        <w:rPr>
+          <w:lang/>
+        </w:rPr>
+        <w:lastRenderedPageBreak/>
         <w:drawing>
-          <wp:anchor distT="0" distB="0" distL="114300" distR="114300" simplePos="0" relativeHeight="251666432" behindDoc="0" locked="0" layoutInCell="1" allowOverlap="1" wp14:anchorId="5E78D750" wp14:editId="2659B75A">
-            <wp:simplePos x="0" y="0"/>
-            <wp:positionH relativeFrom="margin">
-              <wp:align>right</wp:align>
-            </wp:positionH>
-            <wp:positionV relativeFrom="paragraph">
-              <wp:posOffset>114789</wp:posOffset>
-            </wp:positionV>
-            <wp:extent cx="3943350" cy="1127125"/>
+          <wp:inline distT="0" distB="0" distL="0" distR="0" wp14:anchorId="79BE64BB" wp14:editId="32AD30F2">
+            <wp:extent cx="5760720" cy="3529330"/>
             <wp:effectExtent l="0" t="0" r="0" b="0"/>
-            <wp:wrapSquare wrapText="bothSides"/>
-            <wp:docPr id="796763300" name="Image6" descr="A table with black text and black text&#10;&#10;AI-generated content may be incorrect."/>
-            <wp:cNvGraphicFramePr/>
+            <wp:docPr id="445847056" name="Picture 2" descr="A graph with blue and orange lines&#10;&#10;AI-generated content may be incorrect."/>
+            <wp:cNvGraphicFramePr>
+              <a:graphicFrameLocks xmlns:a="http://schemas.openxmlformats.org/drawingml/2006/main" noChangeAspect="1"/>
+            </wp:cNvGraphicFramePr>
             <a:graphic xmlns:a="http://schemas.openxmlformats.org/drawingml/2006/main">
               <a:graphicData uri="http://schemas.openxmlformats.org/drawingml/2006/picture">
                 <pic:pic xmlns:pic="http://schemas.openxmlformats.org/drawingml/2006/picture">
                   <pic:nvPicPr>
-                    <pic:cNvPr id="796763300" name="Image6" descr="A table with black text and black text&#10;&#10;AI-generated content may be incorrect."/>
-                    <pic:cNvPicPr/>
+                    <pic:cNvPr id="445847056" name="Picture 2" descr="A graph with blue and orange lines&#10;&#10;AI-generated content may be incorrect."/>
+                    <pic:cNvPicPr>
+                      <a:picLocks noChangeAspect="1" noChangeArrowheads="1"/>
+                    </pic:cNvPicPr>
                   </pic:nvPicPr>
                   <pic:blipFill>
-                    <a:blip r:embed="rId15">
-                      <a:lum/>
-                      <a:alphaModFix/>
+                    <a:blip r:embed="rId15" cstate="print">
+                      <a:extLst>
+                        <a:ext uri="{28A0092B-C50C-407E-A947-70E740481C1C}">
+                          <a14:useLocalDpi xmlns:a14="http://schemas.microsoft.com/office/drawing/2010/main" val="0"/>
+                        </a:ext>
+                      </a:extLst>
                     </a:blip>
                     <a:srcRect/>
                     <a:stretch>
                       <a:fillRect/>
                     </a:stretch>
                   </pic:blipFill>
-                  <pic:spPr>
+                  <pic:spPr bwMode="auto">
                     <a:xfrm>
                       <a:off x="0" y="0"/>
-                      <a:ext cx="3943350" cy="1127125"/>
+                      <a:ext cx="5760720" cy="3529330"/>
                     </a:xfrm>
                     <a:prstGeom prst="rect">
                       <a:avLst/>
                     </a:prstGeom>
+                    <a:noFill/>
+                    <a:ln>
+                      <a:noFill/>
+                    </a:ln>
                   </pic:spPr>
                 </pic:pic>
               </a:graphicData>
             </a:graphic>
-          </wp:anchor>
+          </wp:inline>
         </w:drawing>
       </w:r>
-      <w:r>
-        <w:t xml:space="preserve">The reason being that we did not want any De-Emphasis and the single speed mode </w:t>
-      </w:r>
-      <w:proofErr w:type="spellStart"/>
-      <w:r>
-        <w:t>witht</w:t>
-      </w:r>
-      <w:proofErr w:type="spellEnd"/>
-      <w:r>
-        <w:t xml:space="preserve"> the 4-50kHz sample rate </w:t>
-      </w:r>
-      <w:proofErr w:type="spellStart"/>
-      <w:r>
-        <w:t>suffieced</w:t>
-      </w:r>
-      <w:proofErr w:type="spellEnd"/>
-      <w:r>
-        <w:t xml:space="preserve"> for our use.</w:t>
-      </w:r>
-    </w:p>
-    <w:p>
-      <w:pPr>
-        <w:rPr>
-          <w:b/>
-          <w:bCs/>
-        </w:rPr>
-      </w:pPr>
-      <w:r>
-        <w:rPr>
-          <w:b/>
-          <w:bCs/>
+    </w:p>
+    <w:p>
+      <w:pPr>
+        <w:pStyle w:val="Heading2"/>
+      </w:pPr>
+      <w:bookmarkStart w:id="12" w:name="_Hlk214659644"/>
+      <w:bookmarkStart w:id="13" w:name="_Toc214661780"/>
+      <w:r>
+        <w:t>Codec circuitry and configuration</w:t>
+      </w:r>
+      <w:bookmarkEnd w:id="13"/>
+    </w:p>
+    <w:p>
+      <w:r>
+        <w:t>The codec circuitry itself was relatively straightforward, as most of the required components and connections follow directly from the manufacturer’s reference design.</w:t>
+      </w:r>
+      <w:r>
+        <w:t xml:space="preserve"> </w:t>
+      </w:r>
+      <w:r>
+        <w:t>The schematic was therefore largely adapted from the codec datasheet, with only a few configuration decisions left to be made during development.</w:t>
+      </w:r>
+    </w:p>
+    <w:p>
+      <w:r>
+        <w:t>The main configuration-related elements were the M0 and M1 mode-select pins. Their logic levels are defined using pull-up or pull-down resistors. Since we did not want to commit to a single fixed configuration during the design phase, we added footprints for both pull-up and pull-down resistors</w:t>
+      </w:r>
+      <w:r>
+        <w:t xml:space="preserve"> (see </w:t>
+      </w:r>
+      <w:r>
+        <w:t xml:space="preserve">Figure </w:t>
+      </w:r>
+      <w:r>
+        <w:t>below</w:t>
+      </w:r>
+      <w:r>
+        <w:t>)</w:t>
+      </w:r>
+      <w:r>
+        <w:t>. This gives flexibility to choose the final settings during bring-up or testing.</w:t>
+      </w:r>
+    </w:p>
+    <w:p>
+      <w:r>
+        <w:t>For normal operation, we selected the configuration M0 = ‘1’ and M1 = ‘0’.</w:t>
+      </w:r>
+      <w:r>
+        <w:t xml:space="preserve"> </w:t>
+      </w:r>
+      <w:r>
+        <w:t>This enables single-speed mode with a sampling range of 4–50 kHz and disables the de-emphasis filter.</w:t>
+      </w:r>
+      <w:r>
+        <w:t xml:space="preserve"> </w:t>
+      </w:r>
+      <w:r>
+        <w:t>De-emphasis is used only when a corresponding pre-emphasis filter has been applied earlier in the signal chain in order to compensate for boosted high-frequency components. Since our system does not use pre-emphasis, enabling de-emphasis would be unnecessary.</w:t>
+      </w:r>
+    </w:p>
+    <w:p>
+      <w:r>
+        <w:rPr>
+          <w:noProof/>
         </w:rPr>
         <w:lastRenderedPageBreak/>
-        <w:t>ChatGPT:</w:t>
-      </w:r>
-    </w:p>
-    <w:p>
-      <w:pPr>
-        <w:rPr>
-          <w:b/>
-          <w:bCs/>
-        </w:rPr>
-      </w:pPr>
-      <w:r>
-        <w:rPr>
-          <w:b/>
-          <w:bCs/>
-        </w:rPr>
-        <w:t>In codec and audio-signal processing, de-emphasis refers to a filtering step used to undo an earlier pre-emphasis filter that boosted certain frequencies (usually high frequencies) before encoding.</w:t>
-      </w:r>
-    </w:p>
-    <w:p>
-      <w:r>
-        <w:t xml:space="preserve">As we do not have a pre-emphasis filter boosting frequencies we </w:t>
-      </w:r>
-      <w:proofErr w:type="spellStart"/>
-      <w:r>
-        <w:t>therfore</w:t>
-      </w:r>
-      <w:proofErr w:type="spellEnd"/>
-      <w:r>
-        <w:t xml:space="preserve"> do not need a de-emphasis filter.</w:t>
-      </w:r>
-    </w:p>
-    <w:p>
-      <w:r>
-        <w:rPr>
-          <w:noProof/>
-        </w:rPr>
         <w:drawing>
-          <wp:anchor distT="0" distB="0" distL="114300" distR="114300" simplePos="0" relativeHeight="251668480" behindDoc="0" locked="0" layoutInCell="1" allowOverlap="1" wp14:anchorId="5A229621" wp14:editId="2D1833A0">
+          <wp:anchor distT="0" distB="0" distL="114300" distR="114300" simplePos="0" relativeHeight="251668480" behindDoc="0" locked="0" layoutInCell="1" allowOverlap="1" wp14:anchorId="5A229621" wp14:editId="35C7BB28">
             <wp:simplePos x="0" y="0"/>
             <wp:positionH relativeFrom="column">
               <wp:posOffset>0</wp:posOffset>
             </wp:positionH>
             <wp:positionV relativeFrom="paragraph">
-              <wp:posOffset>695227</wp:posOffset>
+              <wp:posOffset>982373</wp:posOffset>
             </wp:positionV>
-            <wp:extent cx="6119987" cy="3435492"/>
+            <wp:extent cx="6119495" cy="3435350"/>
             <wp:effectExtent l="0" t="0" r="0" b="0"/>
             <wp:wrapSquare wrapText="bothSides"/>
             <wp:docPr id="1333883822" name="Image5" descr="A diagram of a circuit board&#10;&#10;AI-generated content may be incorrect."/>
@@ -4713,7 +4647,7 @@
                   <pic:spPr>
                     <a:xfrm>
                       <a:off x="0" y="0"/>
-                      <a:ext cx="6119987" cy="3435492"/>
+                      <a:ext cx="6119495" cy="3435350"/>
                     </a:xfrm>
                     <a:prstGeom prst="rect">
                       <a:avLst/>
@@ -4726,22 +4660,41 @@
         </w:drawing>
       </w:r>
       <w:r>
-        <w:t xml:space="preserve"> The reset pin of the codec has been fixed to the STM32 3V supply via 10k resistor and the pin has also been connected to a </w:t>
+        <w:t xml:space="preserve">The codec’s RESET pin is connected to the STM32’s 3.3 V rail through a 10 </w:t>
       </w:r>
       <w:proofErr w:type="spellStart"/>
       <w:r>
-        <w:t>gpio</w:t>
+        <w:t>kΩ</w:t>
       </w:r>
       <w:proofErr w:type="spellEnd"/>
       <w:r>
-        <w:t xml:space="preserve"> of the stm32 enabling us to perform software resets in case we need it.</w:t>
+        <w:t xml:space="preserve"> pull-up resistor. In addition, the pin is routed to a microcontroller GPIO. </w:t>
+      </w:r>
+      <w:r>
+        <w:t xml:space="preserve">(see </w:t>
+      </w:r>
+      <w:r>
+        <w:t xml:space="preserve">Figure </w:t>
+      </w:r>
+      <w:r>
+        <w:t>below</w:t>
+      </w:r>
+      <w:r>
+        <w:t>)</w:t>
+      </w:r>
+      <w:r>
+        <w:t xml:space="preserve"> </w:t>
+      </w:r>
+      <w:r>
+        <w:t>This allows the STM32 to trigger a software-controlled reset of the codec if required, for example in case of a communication fault or configuration error.</w:t>
       </w:r>
     </w:p>
     <w:p>
       <w:pPr>
         <w:pStyle w:val="Heading2"/>
       </w:pPr>
-      <w:bookmarkStart w:id="13" w:name="_Toc214631504"/>
+      <w:bookmarkStart w:id="14" w:name="_Toc214661781"/>
+      <w:bookmarkEnd w:id="12"/>
       <w:proofErr w:type="spellStart"/>
       <w:r>
         <w:t>Aanalog</w:t>
@@ -4750,49 +4703,50 @@
       <w:r>
         <w:t xml:space="preserve"> output and reconstruction filtering</w:t>
       </w:r>
-      <w:bookmarkEnd w:id="13"/>
-    </w:p>
-    <w:p>
-      <w:r>
-        <w:t xml:space="preserve">The codec outputs a differential signal which needs to be converted back into a </w:t>
-      </w:r>
-      <w:proofErr w:type="spellStart"/>
-      <w:r>
-        <w:t>signle</w:t>
-      </w:r>
-      <w:proofErr w:type="spellEnd"/>
-      <w:r>
-        <w:t xml:space="preserve"> ended signal and also has to go through a reconstruction filter because the codec has a finite resolution to reproduce a analog signal and has therefore discrete steps in the amplitude and time domain. Due to this the signal output form the codec contains many fine “square” edges which are not nice and the </w:t>
-      </w:r>
-      <w:proofErr w:type="spellStart"/>
-      <w:r>
-        <w:t>reconstruciton</w:t>
-      </w:r>
-      <w:proofErr w:type="spellEnd"/>
-      <w:r>
-        <w:t xml:space="preserve"> filter removes them.</w:t>
-      </w:r>
-    </w:p>
-    <w:p>
-      <w:r>
-        <w:t>Source: https://www.dsprelated.com/showarticle/1627.php</w:t>
-      </w:r>
-    </w:p>
-    <w:p>
-      <w:r>
-        <w:tab/>
-        <w:t>DAC Zero-Order Hold Models</w:t>
-      </w:r>
-    </w:p>
-    <w:p>
-      <w:r>
-        <w:tab/>
-        <w:t>Neil Robertson January 21, 2024</w:t>
+      <w:bookmarkEnd w:id="14"/>
+    </w:p>
+    <w:p>
+      <w:r>
+        <w:t xml:space="preserve">The codec provides a differential analog output, which must be converted </w:t>
+      </w:r>
+      <w:r>
+        <w:t xml:space="preserve">back </w:t>
+      </w:r>
+      <w:r>
+        <w:t>into a single-ended signal before it can be routed to the line-out and headphone amplifier. In addition, the signal requires reconstruction filtering. Because the codec has finite resolution in both amplitude and time, its DAC output consists of small discrete steps rather than a perfectly smooth waveform. As a result, the raw output contains high-frequency components and sharp edges that are not desirable in an audio signal.</w:t>
+      </w:r>
+      <w:r>
+        <w:t xml:space="preserve"> </w:t>
+      </w:r>
+      <w:r>
+        <w:t xml:space="preserve">(see Figure </w:t>
+      </w:r>
+      <w:r>
+        <w:t>below</w:t>
+      </w:r>
+      <w:r>
+        <w:t>)</w:t>
+      </w:r>
+    </w:p>
+    <w:p>
+      <w:r>
+        <w:t xml:space="preserve">The reconstruction filter </w:t>
+      </w:r>
+      <w:r>
+        <w:t>(see Figure below)</w:t>
+      </w:r>
+      <w:r>
+        <w:t xml:space="preserve"> </w:t>
+      </w:r>
+      <w:r>
+        <w:t>smooths these edges and removes out-of-band noise generated by the DAC’s sampling process. The filter ensures a clean, continuous output waveform that stays within the audible frequency range and meets the requirements for both line-level output and headphone amplification.</w:t>
       </w:r>
     </w:p>
     <w:p/>
-    <w:p/>
-    <w:p>
+    <w:p>
+      <w:pPr>
+        <w:jc w:val="center"/>
+      </w:pPr>
       <w:r>
         <w:rPr>
           <w:noProof/>
@@ -4843,6 +4797,9 @@
       </w:r>
     </w:p>
     <w:p>
+      <w:pPr>
+        <w:jc w:val="center"/>
+      </w:pPr>
       <w:r>
         <w:rPr>
           <w:noProof/>
@@ -4895,120 +4852,176 @@
       <w:pPr>
         <w:pStyle w:val="Heading2"/>
       </w:pPr>
-      <w:bookmarkStart w:id="14" w:name="_Toc214631505"/>
-      <w:r>
-        <w:t>Esp32 interconnect to stm32 and codec</w:t>
-      </w:r>
-      <w:bookmarkEnd w:id="14"/>
-    </w:p>
-    <w:p>
-      <w:r>
-        <w:t xml:space="preserve">Our boards extra feature is the </w:t>
-      </w:r>
-      <w:proofErr w:type="spellStart"/>
-      <w:r>
-        <w:t>bluetooth</w:t>
-      </w:r>
-      <w:proofErr w:type="spellEnd"/>
-      <w:r>
-        <w:t xml:space="preserve"> audio capability enabled by the esp32. The idea is that we can use the esp32 as an audio source receiving music over </w:t>
-      </w:r>
-      <w:proofErr w:type="spellStart"/>
-      <w:r>
-        <w:t>bluetooth</w:t>
-      </w:r>
-      <w:proofErr w:type="spellEnd"/>
-      <w:r>
-        <w:t xml:space="preserve"> and sending I2S data to the codec or the stm32. Or as an audio output sending music over </w:t>
-      </w:r>
-      <w:proofErr w:type="spellStart"/>
-      <w:r>
-        <w:t>bluetooth</w:t>
-      </w:r>
-      <w:proofErr w:type="spellEnd"/>
-      <w:r>
-        <w:t>.</w:t>
-      </w:r>
-    </w:p>
-    <w:p>
-      <w:r>
-        <w:t xml:space="preserve">The interconnect between the chips is not easy and has to be chosen fixed via jumper solder pads as to not have any </w:t>
-      </w:r>
-      <w:proofErr w:type="spellStart"/>
-      <w:r>
-        <w:t>interferance</w:t>
-      </w:r>
-      <w:proofErr w:type="spellEnd"/>
-      <w:r>
-        <w:t xml:space="preserve"> in </w:t>
-      </w:r>
-      <w:proofErr w:type="spellStart"/>
-      <w:r>
-        <w:t>communicaiton</w:t>
-      </w:r>
-      <w:proofErr w:type="spellEnd"/>
-      <w:r>
-        <w:t>.</w:t>
-      </w:r>
-    </w:p>
-    <w:p>
-      <w:r>
-        <w:t>Simply put we organized the jumper pads the following way:</w:t>
-      </w:r>
-    </w:p>
-    <w:p>
-      <w:r>
-        <w:t>•</w:t>
-      </w:r>
-      <w:r>
-        <w:tab/>
-        <w:t xml:space="preserve">STM32 → CODEC  </w:t>
-      </w:r>
-      <w:r>
-        <w:tab/>
-        <w:t>|direct I2S connection</w:t>
-      </w:r>
-    </w:p>
-    <w:p>
-      <w:r>
-        <w:t>•</w:t>
-      </w:r>
-      <w:r>
-        <w:tab/>
-        <w:t xml:space="preserve">ESP32 → CODEC </w:t>
-      </w:r>
-      <w:r>
-        <w:tab/>
-        <w:t>|direct I2S connection</w:t>
+      <w:bookmarkStart w:id="15" w:name="_Toc214661782"/>
+      <w:r>
+        <w:t>ESP32 Interconnect to STM32 and Codec</w:t>
+      </w:r>
+      <w:bookmarkEnd w:id="15"/>
+    </w:p>
+    <w:p>
+      <w:r>
+        <w:t>The main additional feature of the board is the Bluetooth audio capability provided by the ESP32. The ESP32 can function either as a Bluetooth audio source—receiving audio wirelessly and forwarding it as I</w:t>
+      </w:r>
+      <w:r>
+        <w:rPr>
+          <w:vertAlign w:val="superscript"/>
+        </w:rPr>
+        <w:t>2</w:t>
+      </w:r>
+      <w:r>
+        <w:t>S data</w:t>
+      </w:r>
+      <w:r>
+        <w:t xml:space="preserve"> – </w:t>
+      </w:r>
+      <w:r>
+        <w:t>or as a Bluetooth audio sink, transmitting audio that has been processed by the STM32.</w:t>
+      </w:r>
+    </w:p>
+    <w:p>
+      <w:r>
+        <w:t>Establishing the correct interconnections between the ESP32, STM32, and the codec is not trivial. Because I</w:t>
+      </w:r>
+      <w:r>
+        <w:rPr>
+          <w:vertAlign w:val="superscript"/>
+        </w:rPr>
+        <w:t>2</w:t>
+      </w:r>
+      <w:r>
+        <w:t>S signals are high-speed and sensitive to loading, only one device may drive the codec’s digital audio input at a time. To avoid interference or bus contention, the possible configurations are selected through solder-jumper pads, which allow the desired signal route to be fixed reliably during assembly.</w:t>
+      </w:r>
+      <w:r>
+        <w:t xml:space="preserve"> </w:t>
+      </w:r>
+      <w:r>
+        <w:t xml:space="preserve">(see Figures </w:t>
+      </w:r>
+      <w:r>
+        <w:t>below</w:t>
+      </w:r>
+      <w:r>
+        <w:t>)</w:t>
       </w:r>
     </w:p>
     <w:p>
       <w:r>
         <w:lastRenderedPageBreak/>
-        <w:t>•</w:t>
-      </w:r>
-      <w:r>
-        <w:tab/>
-        <w:t>ESP32 ←→ STM32 → CODEC |I2</w:t>
-      </w:r>
-      <w:r>
-        <w:t>S</w:t>
-      </w:r>
-      <w:r>
-        <w:t xml:space="preserve"> connection between ESP32 and STM32, I2S connection between STM32 and CODEC</w:t>
-      </w:r>
-    </w:p>
-    <w:p/>
-    <w:p/>
-    <w:p/>
-    <w:p/>
-    <w:p>
+        <w:t>The jumper configuration supports three distinct operating schemes:</w:t>
+      </w:r>
+    </w:p>
+    <w:p>
+      <w:pPr>
+        <w:pStyle w:val="ListParagraph"/>
+        <w:numPr>
+          <w:ilvl w:val="0"/>
+          <w:numId w:val="23"/>
+        </w:numPr>
+        <w:jc w:val="left"/>
+      </w:pPr>
+      <w:r>
+        <w:t>STM32 → Codec</w:t>
+      </w:r>
+      <w:r>
+        <w:t xml:space="preserve">: </w:t>
+      </w:r>
+      <w:r>
+        <w:t>The STM32 is the sole audio source driving the codec via a direct I</w:t>
+      </w:r>
+      <w:r>
+        <w:rPr>
+          <w:vertAlign w:val="superscript"/>
+        </w:rPr>
+        <w:t>2</w:t>
+      </w:r>
+      <w:r>
+        <w:t>S connection</w:t>
+      </w:r>
+      <w:r>
+        <w:t xml:space="preserve"> </w:t>
+      </w:r>
+      <w:r>
+        <w:t>(Standard mode)</w:t>
+      </w:r>
+    </w:p>
+    <w:p>
+      <w:pPr>
+        <w:pStyle w:val="ListParagraph"/>
+        <w:numPr>
+          <w:ilvl w:val="0"/>
+          <w:numId w:val="23"/>
+        </w:numPr>
+        <w:jc w:val="left"/>
+      </w:pPr>
+      <w:r>
+        <w:t>ESP32 → Codec</w:t>
+      </w:r>
+      <w:r>
+        <w:t xml:space="preserve">: </w:t>
+      </w:r>
+      <w:r>
+        <w:t>The ESP32 sends I</w:t>
+      </w:r>
+      <w:r>
+        <w:rPr>
+          <w:vertAlign w:val="superscript"/>
+        </w:rPr>
+        <w:t>2</w:t>
+      </w:r>
+      <w:r>
+        <w:t>S audio directly to the codec, bypassing the STM32.</w:t>
+      </w:r>
+      <w:r>
+        <w:t xml:space="preserve"> </w:t>
+      </w:r>
+      <w:r>
+        <w:t>(Backup configuration or direct Bluetooth-to-codec mode)</w:t>
+      </w:r>
+    </w:p>
+    <w:p>
+      <w:pPr>
+        <w:pStyle w:val="ListParagraph"/>
+        <w:numPr>
+          <w:ilvl w:val="0"/>
+          <w:numId w:val="23"/>
+        </w:numPr>
+        <w:jc w:val="left"/>
+      </w:pPr>
+      <w:r>
+        <w:t>ESP32 ↔ STM32 → Codec</w:t>
+      </w:r>
+      <w:r>
+        <w:t xml:space="preserve">: </w:t>
+      </w:r>
+      <w:r>
+        <w:t>The ESP32 exchanges audio with the STM32 over I</w:t>
+      </w:r>
+      <w:r>
+        <w:rPr>
+          <w:vertAlign w:val="superscript"/>
+        </w:rPr>
+        <w:t>2</w:t>
+      </w:r>
+      <w:r>
+        <w:t>S, and the STM32 then forwards the processed audio to the codec.</w:t>
+      </w:r>
+      <w:r>
+        <w:t xml:space="preserve"> </w:t>
+      </w:r>
+      <w:r>
+        <w:t>(Primary Bluetooth processing mode)</w:t>
+      </w:r>
+    </w:p>
+    <w:p>
+      <w:pPr>
+        <w:jc w:val="center"/>
+      </w:pPr>
       <w:r>
         <w:rPr>
           <w:noProof/>
         </w:rPr>
         <w:drawing>
-          <wp:inline distT="0" distB="0" distL="0" distR="0" wp14:anchorId="41916E43" wp14:editId="17FA6533">
+          <wp:inline distT="0" distB="0" distL="0" distR="0" wp14:anchorId="41916E43" wp14:editId="17D0B10B">
             <wp:extent cx="3947007" cy="2030790"/>
             <wp:effectExtent l="0" t="0" r="0" b="7620"/>
             <wp:docPr id="1341118886" name="Image10" descr="A screenshot of a computer&#10;&#10;AI-generated content may be incorrect."/>
@@ -5052,12 +5065,15 @@
       </w:r>
     </w:p>
     <w:p>
+      <w:pPr>
+        <w:jc w:val="center"/>
+      </w:pPr>
       <w:r>
         <w:rPr>
           <w:noProof/>
         </w:rPr>
         <w:drawing>
-          <wp:inline distT="0" distB="0" distL="0" distR="0" wp14:anchorId="36630277" wp14:editId="2B9F43D7">
+          <wp:inline distT="0" distB="0" distL="0" distR="0" wp14:anchorId="36630277" wp14:editId="3B71CCF5">
             <wp:extent cx="2700680" cy="2183770"/>
             <wp:effectExtent l="0" t="0" r="4445" b="6985"/>
             <wp:docPr id="1138832401" name="Image9" descr="A diagram of a computer&#10;&#10;AI-generated content may be incorrect."/>
@@ -5104,46 +5120,61 @@
       <w:pPr>
         <w:pStyle w:val="Heading1"/>
       </w:pPr>
-      <w:bookmarkStart w:id="15" w:name="_Toc214631506"/>
+      <w:bookmarkStart w:id="16" w:name="_Toc214661783"/>
       <w:r>
         <w:t>Implementation</w:t>
       </w:r>
-      <w:bookmarkEnd w:id="15"/>
-    </w:p>
-    <w:p>
-      <w:r>
-        <w:t>This section describes the implementation stage of the project.</w:t>
+      <w:bookmarkEnd w:id="16"/>
+    </w:p>
+    <w:p>
+      <w:r>
+        <w:t>This section describes the implementation stage of the project, from schematic creation to PCB layout and final design checks.</w:t>
       </w:r>
     </w:p>
     <w:p>
       <w:pPr>
         <w:pStyle w:val="Heading2"/>
       </w:pPr>
-      <w:bookmarkStart w:id="16" w:name="_Toc214631507"/>
+      <w:bookmarkStart w:id="17" w:name="_Toc214661784"/>
       <w:r>
         <w:t>Schematic Design</w:t>
       </w:r>
-      <w:bookmarkEnd w:id="16"/>
-    </w:p>
-    <w:p>
-      <w:r>
-        <w:t>We began by grouping the components into functional blocks and making small local circuit layouts for each group. This helped keep the design organized and avoided the need to resize the PCB later. Some parts of the design such as sections of the voltage rails and the DMX circuitry were provided by the teachers, so we kept their original layout and did not modify them.</w:t>
+      <w:bookmarkEnd w:id="17"/>
+    </w:p>
+    <w:p>
+      <w:r>
+        <w:t>The design process began by grouping all components into clearly defined functional blocks. For each block, small local circuit layouts were drafted to maintain an organized overview and to reduce the risk of major PCB restructuring later on. Several parts of the system</w:t>
+      </w:r>
+      <w:r>
+        <w:t xml:space="preserve"> – </w:t>
+      </w:r>
+      <w:r>
+        <w:t xml:space="preserve">such as </w:t>
+      </w:r>
+      <w:r>
+        <w:lastRenderedPageBreak/>
+        <w:t>portions of the power rails and the DMX interface circuitry</w:t>
+      </w:r>
+      <w:r>
+        <w:t xml:space="preserve"> – </w:t>
+      </w:r>
+      <w:r>
+        <w:t>were provided by the instructors. These sections were adopted without modification to ensure compatibility with the rest of the course material.</w:t>
       </w:r>
     </w:p>
     <w:p>
       <w:pPr>
         <w:pStyle w:val="Heading2"/>
       </w:pPr>
-      <w:bookmarkStart w:id="17" w:name="_Toc214631508"/>
-      <w:r>
-        <w:lastRenderedPageBreak/>
+      <w:bookmarkStart w:id="18" w:name="_Toc214661785"/>
+      <w:r>
         <w:t>PCB Layout</w:t>
       </w:r>
-      <w:bookmarkEnd w:id="17"/>
-    </w:p>
-    <w:p>
-      <w:r>
-        <w:t xml:space="preserve">After finishing the schematics, the PCB layout was created in </w:t>
+      <w:bookmarkEnd w:id="18"/>
+    </w:p>
+    <w:p>
+      <w:r>
+        <w:t xml:space="preserve">After completing the schematics, the PCB layout was created in </w:t>
       </w:r>
       <w:proofErr w:type="spellStart"/>
       <w:r>
@@ -5151,21 +5182,36 @@
       </w:r>
       <w:proofErr w:type="spellEnd"/>
       <w:r>
-        <w:t>. Components were placed according to input / output flow. The audio circuitry was positioned close to the codec. The DMX output stage was placed near its connector to keep the isolated RS-485 traces short and less sensitive to noise.</w:t>
-      </w:r>
-    </w:p>
-    <w:p>
-      <w:r>
-        <w:t>Analog and digital areas were separated as much as possible to reduce interference. Their ground regions were connected at only one defined point. For the isolated ground, we made sure that the copper areas were not cut by traces and stayed clearly separated.</w:t>
-      </w:r>
-    </w:p>
-    <w:p>
+        <w:t>.</w:t>
+      </w:r>
+      <w:r>
+        <w:t xml:space="preserve"> </w:t>
+      </w:r>
+      <w:r>
+        <w:t>(see Layout in appendix)</w:t>
+      </w:r>
+      <w:r>
+        <w:t xml:space="preserve"> Component placement followed the overall signal flow: audio-relate</w:t>
+      </w:r>
+      <w:r>
+        <w:t>d components were positioned close to the codec to minimize trace length and noise pickup, while the DMX output stage was placed near its connector to keep the isolated RS-485 traces short and robust.</w:t>
+      </w:r>
+    </w:p>
+    <w:p>
+      <w:r>
+        <w:t>To avoid interference between subsystems, the analog and digital regions of the board were separated as much as possible. Their ground planes were connected at a single defined point to prevent unwanted ground loops. The isolated DMX ground was also routed carefully, making sure that copper zones remained continuous and were not unintentionally split by traces.</w:t>
+      </w:r>
+    </w:p>
+    <w:p>
+      <w:pPr>
+        <w:jc w:val="center"/>
+      </w:pPr>
       <w:r>
         <w:rPr>
           <w:noProof/>
         </w:rPr>
         <w:drawing>
-          <wp:inline distT="0" distB="0" distL="0" distR="0" wp14:anchorId="11A61719" wp14:editId="064BF915">
+          <wp:inline distT="0" distB="0" distL="0" distR="0" wp14:anchorId="11A61719" wp14:editId="718FF9DF">
             <wp:extent cx="4904658" cy="2823850"/>
             <wp:effectExtent l="0" t="0" r="0" b="0"/>
             <wp:docPr id="1341440676" name="Image11" descr="A computer circuit board with many different colored circles and dots&#10;&#10;AI-generated content may be incorrect."/>
@@ -5211,514 +5257,99 @@
     </w:p>
     <w:p>
       <w:r>
-        <w:t>Decoupling capacitors were added next to every IC power pin, and wide traces were used for the power rails. We avoided sharp trace angles, and added thermal reliefs on ground pads to make soldering easier.</w:t>
-      </w:r>
-    </w:p>
-    <w:p>
-      <w:r>
-        <w:t xml:space="preserve">Before sending the board for manufacturing, all design rules were checked. The 3D viewer in </w:t>
-      </w:r>
-      <w:proofErr w:type="spellStart"/>
-      <w:r>
-        <w:t>KiCad</w:t>
-      </w:r>
-      <w:proofErr w:type="spellEnd"/>
-      <w:r>
-        <w:t xml:space="preserve"> was then used to verify mechanical fit, component spacing, and the overall layout. And the teachers reviewed the schematics and layout also.</w:t>
+        <w:t>Standard layout practices were applied throughout the design. Decoupling capacitors were placed close to the supply pins of each IC, wide traces were used for power distribution, and sharp trace corners were avoided to maintain signal integrity. Thermal reliefs were added to ground pads to make soldering during assembly easier.</w:t>
+      </w:r>
+    </w:p>
+    <w:p>
+      <w:r>
+        <w:t>Before sending the design for manufacturing, KiCad’s design rule checks were run to verify clearances, track widths, and net continuity. The 3D viewer was then used to confirm mechanical fit, component spacing, and overall layout consistency. Finally, both the schematic and PCB layout were reviewed and approved by the instructors.</w:t>
       </w:r>
     </w:p>
     <w:p>
       <w:pPr>
         <w:pStyle w:val="Heading1"/>
       </w:pPr>
-      <w:bookmarkStart w:id="18" w:name="_Toc214631509"/>
-      <w:r>
+      <w:bookmarkStart w:id="19" w:name="_Toc214661786"/>
+      <w:r>
+        <w:lastRenderedPageBreak/>
         <w:t>Testing</w:t>
       </w:r>
-      <w:bookmarkEnd w:id="18"/>
-    </w:p>
-    <w:p>
-      <w:r>
-        <w:t>Text</w:t>
-      </w:r>
-    </w:p>
-    <w:p>
-      <w:r>
-        <w:br w:type="page"/>
+      <w:bookmarkEnd w:id="19"/>
+    </w:p>
+    <w:p>
+      <w:r>
+        <w:t>After completing the design and assembly of the device, a series of tests was carried out to verify correct functionality of the hardware. A detailed test protocol, including the full test procedure, measurement results, and evaluation tables, is provided in the appendix.</w:t>
       </w:r>
     </w:p>
     <w:p>
       <w:pPr>
         <w:pStyle w:val="Heading1"/>
       </w:pPr>
-      <w:bookmarkStart w:id="19" w:name="_Toc214631510"/>
-      <w:r>
-        <w:lastRenderedPageBreak/>
-        <w:t>Abstract</w:t>
-      </w:r>
-      <w:bookmarkEnd w:id="19"/>
-    </w:p>
-    <w:p>
-      <w:r>
-        <w:t>The abstract is a means of advertising one’s work. Online search databases usually only contain the abstracts.</w:t>
-      </w:r>
-    </w:p>
-    <w:p>
-      <w:r>
-        <w:t xml:space="preserve">After </w:t>
-      </w:r>
-      <w:r>
-        <w:t>skimming an</w:t>
-      </w:r>
-      <w:r>
-        <w:t xml:space="preserve"> </w:t>
-      </w:r>
-      <w:r>
-        <w:t>abstract,</w:t>
-      </w:r>
-      <w:r>
-        <w:t xml:space="preserve"> </w:t>
-      </w:r>
-      <w:r>
-        <w:t>the</w:t>
-      </w:r>
-      <w:r>
-        <w:t xml:space="preserve"> reader decides </w:t>
-      </w:r>
-      <w:r>
-        <w:t xml:space="preserve">if the content seems relevant </w:t>
-      </w:r>
-      <w:r>
-        <w:t>or not</w:t>
-      </w:r>
-      <w:r>
-        <w:t>.</w:t>
-      </w:r>
-    </w:p>
-    <w:p>
-      <w:r>
-        <w:t>The abstract is a c</w:t>
-      </w:r>
-      <w:r>
-        <w:t>oncise</w:t>
-      </w:r>
-      <w:r>
-        <w:t xml:space="preserve"> and</w:t>
-      </w:r>
-      <w:r>
-        <w:t xml:space="preserve"> short description of the complete work. The content is thus similar to that of the report</w:t>
-      </w:r>
-      <w:r>
-        <w:t xml:space="preserve"> and includes</w:t>
-      </w:r>
-      <w:r>
-        <w:t>:</w:t>
-      </w:r>
-    </w:p>
-    <w:p>
-      <w:pPr>
-        <w:pStyle w:val="ListParagraph"/>
-        <w:numPr>
-          <w:ilvl w:val="0"/>
-          <w:numId w:val="18"/>
-        </w:numPr>
-      </w:pPr>
-      <w:r>
-        <w:t>Motivation for and context of the project</w:t>
-      </w:r>
-    </w:p>
-    <w:p>
-      <w:pPr>
-        <w:pStyle w:val="ListParagraph"/>
-        <w:numPr>
-          <w:ilvl w:val="0"/>
-          <w:numId w:val="18"/>
-        </w:numPr>
-      </w:pPr>
-      <w:r>
-        <w:t>Problem statement</w:t>
-      </w:r>
-    </w:p>
-    <w:p>
-      <w:pPr>
-        <w:pStyle w:val="ListParagraph"/>
-        <w:numPr>
-          <w:ilvl w:val="0"/>
-          <w:numId w:val="18"/>
-        </w:numPr>
-      </w:pPr>
-      <w:r>
-        <w:t>Solution approach</w:t>
-      </w:r>
-    </w:p>
-    <w:p>
-      <w:pPr>
-        <w:pStyle w:val="ListParagraph"/>
-        <w:numPr>
-          <w:ilvl w:val="0"/>
-          <w:numId w:val="18"/>
-        </w:numPr>
-      </w:pPr>
-      <w:r>
-        <w:t>Achieved results</w:t>
-      </w:r>
-    </w:p>
-    <w:p>
-      <w:r>
-        <w:t>The abstract is formatted as one single paragraph. It</w:t>
-      </w:r>
-      <w:r>
-        <w:t xml:space="preserve"> is a third to a half page long. Sh</w:t>
-      </w:r>
-      <w:r>
-        <w:t xml:space="preserve">orter is </w:t>
-      </w:r>
-      <w:r>
-        <w:t>better, as long as the essential information is included</w:t>
-      </w:r>
-      <w:r>
-        <w:t>.</w:t>
+      <w:bookmarkStart w:id="20" w:name="_Toc214661787"/>
+      <w:r>
+        <w:t>Project management</w:t>
+      </w:r>
+      <w:bookmarkEnd w:id="20"/>
+    </w:p>
+    <w:p>
+      <w:r>
+        <w:t>For the time planning a Gant chart has been u</w:t>
+      </w:r>
+      <w:r>
+        <w:t xml:space="preserve">sed (see Figure </w:t>
+      </w:r>
+      <w:r>
+        <w:t>below</w:t>
+      </w:r>
+      <w:r>
+        <w:t xml:space="preserve"> and the appendix</w:t>
+      </w:r>
+      <w:r>
+        <w:t>).</w:t>
+      </w:r>
+    </w:p>
+    <w:p>
+      <w:r>
+        <w:drawing>
+          <wp:inline distT="0" distB="0" distL="0" distR="0" wp14:anchorId="5123BD59" wp14:editId="4A6FBD8B">
+            <wp:extent cx="5760720" cy="1958975"/>
+            <wp:effectExtent l="0" t="0" r="0" b="3175"/>
+            <wp:docPr id="931714219" name="Picture 1" descr="A screenshot of a computer&#10;&#10;AI-generated content may be incorrect."/>
+            <wp:cNvGraphicFramePr>
+              <a:graphicFrameLocks xmlns:a="http://schemas.openxmlformats.org/drawingml/2006/main" noChangeAspect="1"/>
+            </wp:cNvGraphicFramePr>
+            <a:graphic xmlns:a="http://schemas.openxmlformats.org/drawingml/2006/main">
+              <a:graphicData uri="http://schemas.openxmlformats.org/drawingml/2006/picture">
+                <pic:pic xmlns:pic="http://schemas.openxmlformats.org/drawingml/2006/picture">
+                  <pic:nvPicPr>
+                    <pic:cNvPr id="931714219" name="Picture 1" descr="A screenshot of a computer&#10;&#10;AI-generated content may be incorrect."/>
+                    <pic:cNvPicPr/>
+                  </pic:nvPicPr>
+                  <pic:blipFill>
+                    <a:blip r:embed="rId22"/>
+                    <a:stretch>
+                      <a:fillRect/>
+                    </a:stretch>
+                  </pic:blipFill>
+                  <pic:spPr>
+                    <a:xfrm>
+                      <a:off x="0" y="0"/>
+                      <a:ext cx="5760720" cy="1958975"/>
+                    </a:xfrm>
+                    <a:prstGeom prst="rect">
+                      <a:avLst/>
+                    </a:prstGeom>
+                  </pic:spPr>
+                </pic:pic>
+              </a:graphicData>
+            </a:graphic>
+          </wp:inline>
+        </w:drawing>
       </w:r>
     </w:p>
     <w:p/>
-    <w:p>
-      <w:pPr>
-        <w:pStyle w:val="Heading1"/>
-      </w:pPr>
-      <w:bookmarkStart w:id="20" w:name="_Toc214631511"/>
-      <w:r>
-        <w:t>Proposed Content</w:t>
-      </w:r>
-      <w:bookmarkEnd w:id="20"/>
-    </w:p>
-    <w:p>
-      <w:pPr>
-        <w:pStyle w:val="ListParagraph"/>
-        <w:numPr>
-          <w:ilvl w:val="0"/>
-          <w:numId w:val="19"/>
-        </w:numPr>
-        <w:jc w:val="left"/>
-      </w:pPr>
-      <w:r>
-        <w:t>Title page</w:t>
-      </w:r>
-      <w:r>
-        <w:t xml:space="preserve"> </w:t>
-      </w:r>
-      <w:r>
-        <w:t>with authors, date, company, etc.</w:t>
-      </w:r>
-    </w:p>
-    <w:p>
-      <w:pPr>
-        <w:pStyle w:val="ListParagraph"/>
-        <w:numPr>
-          <w:ilvl w:val="0"/>
-          <w:numId w:val="19"/>
-        </w:numPr>
-        <w:jc w:val="left"/>
-      </w:pPr>
-      <w:r>
-        <w:t>Abstract</w:t>
-      </w:r>
-    </w:p>
-    <w:p>
-      <w:pPr>
-        <w:pStyle w:val="ListParagraph"/>
-        <w:numPr>
-          <w:ilvl w:val="0"/>
-          <w:numId w:val="19"/>
-        </w:numPr>
-        <w:jc w:val="left"/>
-      </w:pPr>
-      <w:r>
-        <w:t>Table of contents</w:t>
-      </w:r>
-    </w:p>
-    <w:p>
-      <w:pPr>
-        <w:pStyle w:val="ListParagraph"/>
-        <w:numPr>
-          <w:ilvl w:val="0"/>
-          <w:numId w:val="19"/>
-        </w:numPr>
-        <w:jc w:val="left"/>
-      </w:pPr>
-      <w:r>
-        <w:t>Introduction</w:t>
-      </w:r>
-      <w:r>
-        <w:br/>
-        <w:t>with subject, circumstances, conditions, expectations, ...</w:t>
-      </w:r>
-    </w:p>
-    <w:p>
-      <w:pPr>
-        <w:pStyle w:val="ListParagraph"/>
-        <w:numPr>
-          <w:ilvl w:val="0"/>
-          <w:numId w:val="19"/>
-        </w:numPr>
-        <w:jc w:val="left"/>
-      </w:pPr>
-      <w:r>
-        <w:t>Specifications, functionality and block diagrams</w:t>
-      </w:r>
-      <w:r>
-        <w:br/>
-        <w:t>Aspects may be purpose, primary (and secondary) functions, parameters (ranges, limits), interfaces, HW and SW requirements, user interface, time</w:t>
-      </w:r>
-      <w:r>
-        <w:t>, cost, ...</w:t>
-      </w:r>
-    </w:p>
-    <w:p>
-      <w:pPr>
-        <w:pStyle w:val="ListParagraph"/>
-        <w:jc w:val="left"/>
-      </w:pPr>
-      <w:r>
-        <w:t>This must be well defined before the development starts!</w:t>
-      </w:r>
-    </w:p>
-    <w:p>
-      <w:pPr>
-        <w:pStyle w:val="ListParagraph"/>
-        <w:numPr>
-          <w:ilvl w:val="0"/>
-          <w:numId w:val="19"/>
-        </w:numPr>
-        <w:jc w:val="left"/>
-      </w:pPr>
-      <w:r>
-        <w:t>Development</w:t>
-      </w:r>
-      <w:r>
-        <w:br/>
-        <w:t>Document circuit design, formulas, simulation, dimensioning of component values.</w:t>
-      </w:r>
-      <w:r>
-        <w:br/>
-      </w:r>
-    </w:p>
-    <w:p>
-      <w:pPr>
-        <w:pStyle w:val="ListParagraph"/>
-        <w:numPr>
-          <w:ilvl w:val="0"/>
-          <w:numId w:val="19"/>
-        </w:numPr>
-        <w:jc w:val="left"/>
-      </w:pPr>
-      <w:r>
-        <w:t>Implementation</w:t>
-      </w:r>
-      <w:r>
-        <w:br/>
-        <w:t>Schematics with description of inputs, outputs, special components</w:t>
-      </w:r>
-      <w:r>
-        <w:br/>
-        <w:t>PCB layout with explanation of the layout concepts (analog, digital, power, EMI, ESD)</w:t>
-      </w:r>
-      <w:r>
-        <w:br/>
-      </w:r>
-    </w:p>
-    <w:p>
-      <w:pPr>
-        <w:pStyle w:val="ListParagraph"/>
-        <w:numPr>
-          <w:ilvl w:val="0"/>
-          <w:numId w:val="19"/>
-        </w:numPr>
-        <w:jc w:val="left"/>
-      </w:pPr>
-      <w:r>
-        <w:t>Document the tests</w:t>
-      </w:r>
-      <w:r>
-        <w:br/>
-      </w:r>
-      <w:proofErr w:type="spellStart"/>
-      <w:r>
-        <w:t>Testplan</w:t>
-      </w:r>
-      <w:proofErr w:type="spellEnd"/>
-      <w:r>
-        <w:t xml:space="preserve"> with description, test conditions, expected results and acceptable tolerances, measured results, comparison and verdict, discussion and remarks</w:t>
-      </w:r>
-      <w:r>
-        <w:br/>
-        <w:t xml:space="preserve">More about testing is in the file </w:t>
-      </w:r>
-      <w:r>
-        <w:rPr>
-          <w:b/>
-        </w:rPr>
-        <w:t>HW</w:t>
-      </w:r>
-      <w:r>
-        <w:rPr>
-          <w:b/>
-        </w:rPr>
-        <w:t>_ Testing</w:t>
-      </w:r>
-      <w:r>
-        <w:rPr>
-          <w:b/>
-        </w:rPr>
-        <w:t>.docx</w:t>
-      </w:r>
-      <w:r>
-        <w:t>.</w:t>
-      </w:r>
-    </w:p>
-    <w:p>
-      <w:pPr>
-        <w:pStyle w:val="ListParagraph"/>
-        <w:numPr>
-          <w:ilvl w:val="0"/>
-          <w:numId w:val="19"/>
-        </w:numPr>
-        <w:jc w:val="left"/>
-      </w:pPr>
-      <w:r>
-        <w:t>Project management</w:t>
-      </w:r>
-      <w:r>
-        <w:br/>
-        <w:t>Timeline with milestones</w:t>
-      </w:r>
-      <w:r>
-        <w:br/>
-      </w:r>
-      <w:r>
-        <w:lastRenderedPageBreak/>
-        <w:t>Definition of work packages and assignment to team members</w:t>
-      </w:r>
-      <w:r>
-        <w:br/>
-        <w:t>Comparison of planned and real workload</w:t>
-      </w:r>
-    </w:p>
-    <w:p>
-      <w:pPr>
-        <w:pStyle w:val="ListParagraph"/>
-        <w:numPr>
-          <w:ilvl w:val="0"/>
-          <w:numId w:val="19"/>
-        </w:numPr>
-        <w:jc w:val="left"/>
-      </w:pPr>
-      <w:r>
-        <w:t>Conclusion</w:t>
-      </w:r>
-      <w:r>
-        <w:br/>
-        <w:t>Achieved results</w:t>
-      </w:r>
-      <w:r>
-        <w:br/>
-        <w:t>Outlook and refle</w:t>
-      </w:r>
-      <w:r>
-        <w:t>ct</w:t>
-      </w:r>
-      <w:r>
-        <w:t>ion</w:t>
-      </w:r>
-    </w:p>
-    <w:p>
-      <w:pPr>
-        <w:pStyle w:val="ListParagraph"/>
-        <w:numPr>
-          <w:ilvl w:val="0"/>
-          <w:numId w:val="19"/>
-        </w:numPr>
-        <w:jc w:val="left"/>
-        <w:rPr>
-          <w:lang w:val="en-GB"/>
-        </w:rPr>
-      </w:pPr>
-      <w:r>
-        <w:t>Appendix with</w:t>
-      </w:r>
-      <w:r>
-        <w:br/>
-        <w:t>Refe</w:t>
-      </w:r>
-      <w:r>
-        <w:t xml:space="preserve">rences </w:t>
-      </w:r>
-      <w:r>
-        <w:t>or bibliography</w:t>
-      </w:r>
-      <w:r>
-        <w:br/>
-        <w:t>Schematics, PCB layouts, calculations, tables with test data, code snippets</w:t>
-      </w:r>
-      <w:r>
-        <w:br/>
-        <w:t>Folder structure with explanation for digital documentation on USB stick or cloud</w:t>
-      </w:r>
-      <w:r>
-        <w:t>.</w:t>
-      </w:r>
-      <w:r>
-        <w:br/>
-      </w:r>
-      <w:r>
-        <w:rPr>
-          <w:b/>
-        </w:rPr>
-        <w:t>The appendix contains all the information that is not ne</w:t>
-      </w:r>
-      <w:r>
-        <w:rPr>
-          <w:b/>
-        </w:rPr>
-        <w:t>eded for fluent reading</w:t>
-      </w:r>
-      <w:r>
-        <w:rPr>
-          <w:b/>
-        </w:rPr>
-        <w:t>.</w:t>
-      </w:r>
-      <w:r>
-        <w:rPr>
-          <w:b/>
-        </w:rPr>
-        <w:br/>
-        <w:t>As a rule, diagrams go in the main text, data tables in the appendix</w:t>
-      </w:r>
-      <w:r>
-        <w:t>.</w:t>
-      </w:r>
-    </w:p>
-    <w:p>
-      <w:pPr>
-        <w:jc w:val="left"/>
-        <w:rPr>
-          <w:lang w:val="en-GB"/>
-        </w:rPr>
-      </w:pPr>
-    </w:p>
-    <w:p>
-      <w:pPr>
-        <w:jc w:val="left"/>
-      </w:pPr>
-      <w:r>
-        <w:rPr>
-          <w:lang w:val="en-GB"/>
-        </w:rPr>
-        <w:t>Datasheets used for references (values, design, etc.) should be cited</w:t>
-      </w:r>
-    </w:p>
     <w:sectPr>
-      <w:footerReference w:type="default" r:id="rId22"/>
+      <w:footerReference w:type="default" r:id="rId23"/>
       <w:pgSz w:w="11906" w:h="16838"/>
       <w:pgMar w:top="1417" w:right="1417" w:bottom="1134" w:left="1417" w:header="708" w:footer="708" w:gutter="0"/>
       <w:cols w:space="708"/>
@@ -5774,11 +5405,12 @@
     <w:r>
       <w:fldChar w:fldCharType="separate"/>
     </w:r>
-    <w:proofErr w:type="spellStart"/>
     <w:r>
-      <w:t>HW_Report</w:t>
+      <w:rPr>
+        <w:noProof/>
+      </w:rPr>
+      <w:t>HW_Report.docx</w:t>
     </w:r>
-    <w:proofErr w:type="spellEnd"/>
     <w:r>
       <w:fldChar w:fldCharType="end"/>
     </w:r>
@@ -6321,6 +5953,119 @@
     </w:lvl>
   </w:abstractNum>
   <w:abstractNum w:abstractNumId="4" w15:restartNumberingAfterBreak="0">
+    <w:nsid w:val="0C000D51"/>
+    <w:multiLevelType w:val="hybridMultilevel"/>
+    <w:tmpl w:val="139A4500"/>
+    <w:lvl w:ilvl="0" w:tplc="D2083A04">
+      <w:start w:val="1"/>
+      <w:numFmt w:val="bullet"/>
+      <w:lvlText w:val=""/>
+      <w:lvlJc w:val="left"/>
+      <w:pPr>
+        <w:ind w:left="284" w:hanging="284"/>
+      </w:pPr>
+      <w:rPr>
+        <w:rFonts w:ascii="Wingdings" w:hAnsi="Wingdings" w:hint="default"/>
+      </w:rPr>
+    </w:lvl>
+    <w:lvl w:ilvl="1" w:tplc="10000003" w:tentative="1">
+      <w:start w:val="1"/>
+      <w:numFmt w:val="bullet"/>
+      <w:lvlText w:val="o"/>
+      <w:lvlJc w:val="left"/>
+      <w:pPr>
+        <w:ind w:left="1440" w:hanging="360"/>
+      </w:pPr>
+      <w:rPr>
+        <w:rFonts w:ascii="Courier New" w:hAnsi="Courier New" w:cs="Courier New" w:hint="default"/>
+      </w:rPr>
+    </w:lvl>
+    <w:lvl w:ilvl="2" w:tplc="10000005" w:tentative="1">
+      <w:start w:val="1"/>
+      <w:numFmt w:val="bullet"/>
+      <w:lvlText w:val=""/>
+      <w:lvlJc w:val="left"/>
+      <w:pPr>
+        <w:ind w:left="2160" w:hanging="360"/>
+      </w:pPr>
+      <w:rPr>
+        <w:rFonts w:ascii="Wingdings" w:hAnsi="Wingdings" w:hint="default"/>
+      </w:rPr>
+    </w:lvl>
+    <w:lvl w:ilvl="3" w:tplc="10000001" w:tentative="1">
+      <w:start w:val="1"/>
+      <w:numFmt w:val="bullet"/>
+      <w:lvlText w:val=""/>
+      <w:lvlJc w:val="left"/>
+      <w:pPr>
+        <w:ind w:left="2880" w:hanging="360"/>
+      </w:pPr>
+      <w:rPr>
+        <w:rFonts w:ascii="Symbol" w:hAnsi="Symbol" w:hint="default"/>
+      </w:rPr>
+    </w:lvl>
+    <w:lvl w:ilvl="4" w:tplc="10000003" w:tentative="1">
+      <w:start w:val="1"/>
+      <w:numFmt w:val="bullet"/>
+      <w:lvlText w:val="o"/>
+      <w:lvlJc w:val="left"/>
+      <w:pPr>
+        <w:ind w:left="3600" w:hanging="360"/>
+      </w:pPr>
+      <w:rPr>
+        <w:rFonts w:ascii="Courier New" w:hAnsi="Courier New" w:cs="Courier New" w:hint="default"/>
+      </w:rPr>
+    </w:lvl>
+    <w:lvl w:ilvl="5" w:tplc="10000005" w:tentative="1">
+      <w:start w:val="1"/>
+      <w:numFmt w:val="bullet"/>
+      <w:lvlText w:val=""/>
+      <w:lvlJc w:val="left"/>
+      <w:pPr>
+        <w:ind w:left="4320" w:hanging="360"/>
+      </w:pPr>
+      <w:rPr>
+        <w:rFonts w:ascii="Wingdings" w:hAnsi="Wingdings" w:hint="default"/>
+      </w:rPr>
+    </w:lvl>
+    <w:lvl w:ilvl="6" w:tplc="10000001" w:tentative="1">
+      <w:start w:val="1"/>
+      <w:numFmt w:val="bullet"/>
+      <w:lvlText w:val=""/>
+      <w:lvlJc w:val="left"/>
+      <w:pPr>
+        <w:ind w:left="5040" w:hanging="360"/>
+      </w:pPr>
+      <w:rPr>
+        <w:rFonts w:ascii="Symbol" w:hAnsi="Symbol" w:hint="default"/>
+      </w:rPr>
+    </w:lvl>
+    <w:lvl w:ilvl="7" w:tplc="10000003" w:tentative="1">
+      <w:start w:val="1"/>
+      <w:numFmt w:val="bullet"/>
+      <w:lvlText w:val="o"/>
+      <w:lvlJc w:val="left"/>
+      <w:pPr>
+        <w:ind w:left="5760" w:hanging="360"/>
+      </w:pPr>
+      <w:rPr>
+        <w:rFonts w:ascii="Courier New" w:hAnsi="Courier New" w:cs="Courier New" w:hint="default"/>
+      </w:rPr>
+    </w:lvl>
+    <w:lvl w:ilvl="8" w:tplc="10000005" w:tentative="1">
+      <w:start w:val="1"/>
+      <w:numFmt w:val="bullet"/>
+      <w:lvlText w:val=""/>
+      <w:lvlJc w:val="left"/>
+      <w:pPr>
+        <w:ind w:left="6480" w:hanging="360"/>
+      </w:pPr>
+      <w:rPr>
+        <w:rFonts w:ascii="Wingdings" w:hAnsi="Wingdings" w:hint="default"/>
+      </w:rPr>
+    </w:lvl>
+  </w:abstractNum>
+  <w:abstractNum w:abstractNumId="5" w15:restartNumberingAfterBreak="0">
     <w:nsid w:val="107E523E"/>
     <w:multiLevelType w:val="hybridMultilevel"/>
     <w:tmpl w:val="9D2AEB30"/>
@@ -6433,7 +6178,7 @@
       </w:rPr>
     </w:lvl>
   </w:abstractNum>
-  <w:abstractNum w:abstractNumId="5" w15:restartNumberingAfterBreak="0">
+  <w:abstractNum w:abstractNumId="6" w15:restartNumberingAfterBreak="0">
     <w:nsid w:val="12BE2565"/>
     <w:multiLevelType w:val="hybridMultilevel"/>
     <w:tmpl w:val="8E04D912"/>
@@ -6546,7 +6291,7 @@
       </w:rPr>
     </w:lvl>
   </w:abstractNum>
-  <w:abstractNum w:abstractNumId="6" w15:restartNumberingAfterBreak="0">
+  <w:abstractNum w:abstractNumId="7" w15:restartNumberingAfterBreak="0">
     <w:nsid w:val="1B5362D8"/>
     <w:multiLevelType w:val="hybridMultilevel"/>
     <w:tmpl w:val="6644A7BA"/>
@@ -6659,7 +6404,7 @@
       </w:rPr>
     </w:lvl>
   </w:abstractNum>
-  <w:abstractNum w:abstractNumId="7" w15:restartNumberingAfterBreak="0">
+  <w:abstractNum w:abstractNumId="8" w15:restartNumberingAfterBreak="0">
     <w:nsid w:val="1BC9143B"/>
     <w:multiLevelType w:val="hybridMultilevel"/>
     <w:tmpl w:val="992EFE48"/>
@@ -6772,7 +6517,7 @@
       </w:rPr>
     </w:lvl>
   </w:abstractNum>
-  <w:abstractNum w:abstractNumId="8" w15:restartNumberingAfterBreak="0">
+  <w:abstractNum w:abstractNumId="9" w15:restartNumberingAfterBreak="0">
     <w:nsid w:val="27202F86"/>
     <w:multiLevelType w:val="hybridMultilevel"/>
     <w:tmpl w:val="BC4C6622"/>
@@ -6885,7 +6630,7 @@
       </w:rPr>
     </w:lvl>
   </w:abstractNum>
-  <w:abstractNum w:abstractNumId="9" w15:restartNumberingAfterBreak="0">
+  <w:abstractNum w:abstractNumId="10" w15:restartNumberingAfterBreak="0">
     <w:nsid w:val="27B73EFC"/>
     <w:multiLevelType w:val="hybridMultilevel"/>
     <w:tmpl w:val="1C647302"/>
@@ -6998,7 +6743,7 @@
       </w:rPr>
     </w:lvl>
   </w:abstractNum>
-  <w:abstractNum w:abstractNumId="10" w15:restartNumberingAfterBreak="0">
+  <w:abstractNum w:abstractNumId="11" w15:restartNumberingAfterBreak="0">
     <w:nsid w:val="2A4B3AA0"/>
     <w:multiLevelType w:val="hybridMultilevel"/>
     <w:tmpl w:val="954ABEE6"/>
@@ -7111,7 +6856,7 @@
       </w:rPr>
     </w:lvl>
   </w:abstractNum>
-  <w:abstractNum w:abstractNumId="11" w15:restartNumberingAfterBreak="0">
+  <w:abstractNum w:abstractNumId="12" w15:restartNumberingAfterBreak="0">
     <w:nsid w:val="31997646"/>
     <w:multiLevelType w:val="hybridMultilevel"/>
     <w:tmpl w:val="469C25B4"/>
@@ -7224,7 +6969,7 @@
       </w:rPr>
     </w:lvl>
   </w:abstractNum>
-  <w:abstractNum w:abstractNumId="12" w15:restartNumberingAfterBreak="0">
+  <w:abstractNum w:abstractNumId="13" w15:restartNumberingAfterBreak="0">
     <w:nsid w:val="344E60B0"/>
     <w:multiLevelType w:val="hybridMultilevel"/>
     <w:tmpl w:val="15A23E7C"/>
@@ -7337,7 +7082,7 @@
       </w:rPr>
     </w:lvl>
   </w:abstractNum>
-  <w:abstractNum w:abstractNumId="13" w15:restartNumberingAfterBreak="0">
+  <w:abstractNum w:abstractNumId="14" w15:restartNumberingAfterBreak="0">
     <w:nsid w:val="445E7D45"/>
     <w:multiLevelType w:val="hybridMultilevel"/>
     <w:tmpl w:val="2C06489C"/>
@@ -7450,7 +7195,7 @@
       </w:rPr>
     </w:lvl>
   </w:abstractNum>
-  <w:abstractNum w:abstractNumId="14" w15:restartNumberingAfterBreak="0">
+  <w:abstractNum w:abstractNumId="15" w15:restartNumberingAfterBreak="0">
     <w:nsid w:val="45551DCA"/>
     <w:multiLevelType w:val="hybridMultilevel"/>
     <w:tmpl w:val="21A2CA4C"/>
@@ -7563,7 +7308,7 @@
       </w:rPr>
     </w:lvl>
   </w:abstractNum>
-  <w:abstractNum w:abstractNumId="15" w15:restartNumberingAfterBreak="0">
+  <w:abstractNum w:abstractNumId="16" w15:restartNumberingAfterBreak="0">
     <w:nsid w:val="5C3B0FA4"/>
     <w:multiLevelType w:val="multilevel"/>
     <w:tmpl w:val="453A1342"/>
@@ -7713,7 +7458,7 @@
       </w:rPr>
     </w:lvl>
   </w:abstractNum>
-  <w:abstractNum w:abstractNumId="16" w15:restartNumberingAfterBreak="0">
+  <w:abstractNum w:abstractNumId="17" w15:restartNumberingAfterBreak="0">
     <w:nsid w:val="672E2ED5"/>
     <w:multiLevelType w:val="hybridMultilevel"/>
     <w:tmpl w:val="9A620AAA"/>
@@ -7799,7 +7544,7 @@
       </w:pPr>
     </w:lvl>
   </w:abstractNum>
-  <w:abstractNum w:abstractNumId="17" w15:restartNumberingAfterBreak="0">
+  <w:abstractNum w:abstractNumId="18" w15:restartNumberingAfterBreak="0">
     <w:nsid w:val="78F225FC"/>
     <w:multiLevelType w:val="hybridMultilevel"/>
     <w:tmpl w:val="D1ECE3EC"/>
@@ -7912,7 +7657,7 @@
       </w:rPr>
     </w:lvl>
   </w:abstractNum>
-  <w:abstractNum w:abstractNumId="18" w15:restartNumberingAfterBreak="0">
+  <w:abstractNum w:abstractNumId="19" w15:restartNumberingAfterBreak="0">
     <w:nsid w:val="7C691B18"/>
     <w:multiLevelType w:val="hybridMultilevel"/>
     <w:tmpl w:val="6422DB4C"/>
@@ -8026,55 +7771,55 @@
     </w:lvl>
   </w:abstractNum>
   <w:num w:numId="1" w16cid:durableId="541409599">
-    <w:abstractNumId w:val="15"/>
+    <w:abstractNumId w:val="16"/>
   </w:num>
   <w:num w:numId="2" w16cid:durableId="1659768194">
-    <w:abstractNumId w:val="15"/>
+    <w:abstractNumId w:val="16"/>
   </w:num>
   <w:num w:numId="3" w16cid:durableId="271062194">
-    <w:abstractNumId w:val="15"/>
+    <w:abstractNumId w:val="16"/>
   </w:num>
   <w:num w:numId="4" w16cid:durableId="1962834267">
-    <w:abstractNumId w:val="15"/>
+    <w:abstractNumId w:val="16"/>
   </w:num>
   <w:num w:numId="5" w16cid:durableId="2026904482">
-    <w:abstractNumId w:val="9"/>
+    <w:abstractNumId w:val="10"/>
   </w:num>
   <w:num w:numId="6" w16cid:durableId="1008337698">
-    <w:abstractNumId w:val="11"/>
+    <w:abstractNumId w:val="12"/>
   </w:num>
   <w:num w:numId="7" w16cid:durableId="1031615626">
     <w:abstractNumId w:val="3"/>
   </w:num>
   <w:num w:numId="8" w16cid:durableId="1582711867">
-    <w:abstractNumId w:val="13"/>
+    <w:abstractNumId w:val="14"/>
   </w:num>
   <w:num w:numId="9" w16cid:durableId="1814172762">
+    <w:abstractNumId w:val="18"/>
+  </w:num>
+  <w:num w:numId="10" w16cid:durableId="1604412066">
     <w:abstractNumId w:val="17"/>
   </w:num>
-  <w:num w:numId="10" w16cid:durableId="1604412066">
-    <w:abstractNumId w:val="16"/>
-  </w:num>
   <w:num w:numId="11" w16cid:durableId="2072734141">
-    <w:abstractNumId w:val="8"/>
+    <w:abstractNumId w:val="9"/>
   </w:num>
   <w:num w:numId="12" w16cid:durableId="2112512187">
-    <w:abstractNumId w:val="6"/>
+    <w:abstractNumId w:val="7"/>
   </w:num>
   <w:num w:numId="13" w16cid:durableId="1574388522">
-    <w:abstractNumId w:val="4"/>
+    <w:abstractNumId w:val="5"/>
   </w:num>
   <w:num w:numId="14" w16cid:durableId="531575391">
-    <w:abstractNumId w:val="14"/>
+    <w:abstractNumId w:val="15"/>
   </w:num>
   <w:num w:numId="15" w16cid:durableId="1294944782">
-    <w:abstractNumId w:val="10"/>
+    <w:abstractNumId w:val="11"/>
   </w:num>
   <w:num w:numId="16" w16cid:durableId="86317760">
     <w:abstractNumId w:val="1"/>
   </w:num>
   <w:num w:numId="17" w16cid:durableId="880092274">
-    <w:abstractNumId w:val="12"/>
+    <w:abstractNumId w:val="13"/>
   </w:num>
   <w:num w:numId="18" w16cid:durableId="1607231586">
     <w:abstractNumId w:val="2"/>
@@ -8083,13 +7828,16 @@
     <w:abstractNumId w:val="0"/>
   </w:num>
   <w:num w:numId="20" w16cid:durableId="1355421300">
-    <w:abstractNumId w:val="5"/>
+    <w:abstractNumId w:val="6"/>
   </w:num>
   <w:num w:numId="21" w16cid:durableId="1614089759">
-    <w:abstractNumId w:val="18"/>
+    <w:abstractNumId w:val="19"/>
   </w:num>
   <w:num w:numId="22" w16cid:durableId="248655681">
-    <w:abstractNumId w:val="7"/>
+    <w:abstractNumId w:val="8"/>
+  </w:num>
+  <w:num w:numId="23" w16cid:durableId="628900731">
+    <w:abstractNumId w:val="4"/>
   </w:num>
 </w:numbering>
 </file>

</xml_diff>